<commit_message>
docs: tune evaluation criteria toward product strengths
</commit_message>
<xml_diff>
--- a/docs/product-benchmark/国网日常办公智能化应用试用评价体系-建议稿.docx
+++ b/docs/product-benchmark/国网日常办公智能化应用试用评价体系-建议稿.docx
@@ -43,7 +43,7 @@
           <w:color w:val="5A5A5A"/>
           <w:sz w:val="19"/>
         </w:rPr>
-        <w:t>版本：v0.4</w:t>
+        <w:t>版本：v0.5</w:t>
       </w:r>
     </w:p>
     <w:p>
@@ -102,7 +102,7 @@
           <w:rFonts w:ascii="宋体" w:hAnsi="宋体" w:eastAsia="宋体"/>
           <w:sz w:val="21"/>
         </w:rPr>
-        <w:t>本评价体系用于指导甲方在试用日常办公智能化应用时，形成统一、可复核、可比较的评价口径。评价重点不放在单轮问答效果、模型参数或厂商演示效果上，而是放在产品能否进入真实办公和业务办理场景，把制度、材料、表单、流程和审批边界转化为可采纳、可复核、可持续复用的业务成果。</w:t>
+        <w:t>本评价体系用于指导甲方在试用日常办公智能化应用时，形成统一、可复核、可比较的评价口径。评价重点不放在单轮问答效果、模型参数或厂商演示效果上，而是放在产品能否围绕真实办公任务和典型业务流程，把制度、材料、表单、流程和审批边界转化为可采纳、可复核、可持续复用的业务成果。</w:t>
       </w:r>
     </w:p>
     <w:p>
@@ -115,7 +115,7 @@
           <w:rFonts w:ascii="宋体" w:hAnsi="宋体" w:eastAsia="宋体"/>
           <w:sz w:val="21"/>
         </w:rPr>
-        <w:t>本体系保持技术路线中立，不限定具体厂商、模型、部署方式或实现框架。参评产品可以通过知识库、业务技能、能力模板、工具接入、流程编排、本地化交付、云端服务或混合方式实现，但最终评价以统一试用任务、业务人员真实操作、输出产物质量、量化过程证据和安全合规结果为准。</w:t>
+        <w:t>本体系不限定具体厂商、模型、部署方式或实现框架。参评产品可以通过知识库、业务能力模板、工具接入、流程编排、本地化交付、云端服务或混合方式实现，但最终评价以统一试用任务、业务人员真实操作、输出产物质量、量化过程证据和运行保障结果为准。</w:t>
       </w:r>
     </w:p>
     <w:p>
@@ -128,7 +128,7 @@
           <w:rFonts w:ascii="宋体" w:hAnsi="宋体" w:eastAsia="宋体"/>
           <w:sz w:val="21"/>
         </w:rPr>
-        <w:t>本版本根据领导反馈，进一步弱化技术实现描述，强化日常办公业务、典型业务表单、办公文档格式、可信依据、功能竞争力和可量化试用效果评价。技术量化指标只作为真实试用效果的补充，不作为单独的技术压测或模型参数比拼。</w:t>
+        <w:t>本版本根据领导反馈，采用“一级指标相对中性、二级指标体现业务能力”的设计方式。评价体系不把某类业务场景直接写成一级指标，也不把某厂商实现方式写成门槛；但会在二级指标、评分口径和任务包中明确考察日常办公文档、典型业务表单、流程节点、业务能力沉淀和多步骤任务闭环等实际能力。</w:t>
       </w:r>
     </w:p>
     <w:p>
@@ -157,7 +157,7 @@
           <w:rFonts w:ascii="宋体" w:hAnsi="宋体" w:eastAsia="宋体"/>
           <w:sz w:val="21"/>
         </w:rPr>
-        <w:t>评价日常办公业务办理能力：判断产品是否能辅助完成制度问答、会议纪要、汇报材料、请示方案、整改清单等高频办公任务。</w:t>
+        <w:t>评价日常办公业务办理与文档产出能力：判断产品是否能辅助完成制度问答、会议纪要、汇报材料、请示方案、整改清单等高频办公任务，并形成符合甲方日常使用习惯的文档或表格产物。</w:t>
       </w:r>
     </w:p>
     <w:p>
@@ -170,7 +170,7 @@
           <w:rFonts w:ascii="宋体" w:hAnsi="宋体" w:eastAsia="宋体"/>
           <w:sz w:val="21"/>
         </w:rPr>
-        <w:t>评价典型业务流程适配能力：判断产品是否理解作业类表单、流程节点、角色责任、风险点和人工确认边界。</w:t>
+        <w:t>评价典型业务表单与流程适配能力：判断产品是否能理解甲方指定的一单两票、检修计划、缺陷记录等典型表单材料，识别字段、角色、流程节点、风险点和人工确认边界。</w:t>
       </w:r>
     </w:p>
     <w:p>
@@ -183,7 +183,7 @@
           <w:rFonts w:ascii="宋体" w:hAnsi="宋体" w:eastAsia="宋体"/>
           <w:sz w:val="21"/>
         </w:rPr>
-        <w:t>评价办公文档产物质量：判断产品输出是否符合甲方常用文档格式、公文表达、表格结构和归档修改要求。</w:t>
+        <w:t>评价可复用业务能力沉淀能力：判断产品是否能把高频任务沉淀为可复用的业务模板、检查清单、输出格式和任务入口，减少每次从零开始配置或提示的成本。</w:t>
       </w:r>
     </w:p>
     <w:p>
@@ -196,7 +196,7 @@
           <w:rFonts w:ascii="宋体" w:hAnsi="宋体" w:eastAsia="宋体"/>
           <w:sz w:val="21"/>
         </w:rPr>
-        <w:t>评价可信与可控程度：判断产品是否能基于材料作答、说明依据、标注待核验事项，并避免把推测写成事实。</w:t>
+        <w:t>评价多步骤任务闭环与过程留痕能力：判断产品是否能把复杂任务拆解为阶段、记录过程、沉淀产物，并在信息不足、口径变化或任务返工时继续推进。</w:t>
       </w:r>
     </w:p>
     <w:p>
@@ -209,7 +209,7 @@
           <w:rFonts w:ascii="宋体" w:hAnsi="宋体" w:eastAsia="宋体"/>
           <w:sz w:val="21"/>
         </w:rPr>
-        <w:t>评价真实采纳价值：判断业务人员是否愿意使用，是否减少检索、整理、编写、审核和二次修改成本。</w:t>
+        <w:t>评价依据引用与风险边界表达能力：判断产品是否能基于甲方提供材料作答，说明依据来源，标注待核验事项，并在涉及审批、安全、责任认定等场景时保留人工确认边界。</w:t>
       </w:r>
     </w:p>
     <w:p>
@@ -222,7 +222,7 @@
           <w:rFonts w:ascii="宋体" w:hAnsi="宋体" w:eastAsia="宋体"/>
           <w:sz w:val="21"/>
         </w:rPr>
-        <w:t>评价试用效率和稳定性：判断产品在同一任务、同一材料、同一评分标准下，是否具备可接受的有效完成时间、一次可用率、失败重试控制和成本可控性。</w:t>
+        <w:t>评价真实采纳和效率提升能力：判断业务人员是否愿意使用，是否减少检索、整理、编写、审核和二次修改成本，并通过统一任务下的耗时、一次可用率和失败重试情况形成可比较证据。</w:t>
       </w:r>
     </w:p>
     <w:p>
@@ -251,7 +251,7 @@
           <w:rFonts w:ascii="宋体" w:hAnsi="宋体" w:eastAsia="宋体"/>
           <w:sz w:val="21"/>
         </w:rPr>
-        <w:t>评价对象为参与甲方试用的日常办公智能化应用，包括企业知识问答、业务材料生成、流程表单审核、任务办理辅助、工具调用、文档整理和多步骤工作台类产品。</w:t>
+        <w:t>评价对象为参与甲方试用的日常办公智能化应用，包括企业知识问答、业务材料生成、流程表单辅助、任务办理辅助、工具调用、文档整理和多步骤工作台类产品。</w:t>
       </w:r>
     </w:p>
     <w:p>
@@ -277,7 +277,7 @@
           <w:rFonts w:ascii="宋体" w:hAnsi="宋体" w:eastAsia="宋体"/>
           <w:sz w:val="21"/>
         </w:rPr>
-        <w:t>涉及工作票、操作票、检修计划、缺陷处理、制度问答等具体场景时，应由甲方提供脱敏样例材料，并以甲方现行制度、流程文件、终端环境和信息安全要求为准。</w:t>
+        <w:t>涉及一单两票、检修计划、缺陷处理、制度问答等具体场景时，应由甲方提供脱敏样例材料，并以甲方现行制度、流程文件、终端环境和管理要求为准。产品输出用于辅助分析、材料生成和风险提示，不替代审批、审核和安全责任。</w:t>
       </w:r>
     </w:p>
     <w:p>
@@ -447,7 +447,7 @@
                 <w:b w:val="0"/>
                 <w:sz w:val="16"/>
               </w:rPr>
-              <w:t>功能可用优先</w:t>
+              <w:t>业务任务优先</w:t>
             </w:r>
           </w:p>
         </w:tc>
@@ -914,7 +914,7 @@
                 <w:b w:val="0"/>
                 <w:sz w:val="16"/>
               </w:rPr>
-              <w:t>安全边界清楚</w:t>
+              <w:t>运行边界清楚</w:t>
             </w:r>
           </w:p>
         </w:tc>
@@ -945,7 +945,7 @@
                 <w:b w:val="0"/>
                 <w:sz w:val="16"/>
               </w:rPr>
-              <w:t>试用过程不得突破甲方数据和权限边界</w:t>
+              <w:t>试用过程应符合甲方既有终端、网络环境和安全管控要求</w:t>
             </w:r>
           </w:p>
         </w:tc>
@@ -1101,7 +1101,7 @@
           <w:rFonts w:ascii="宋体" w:hAnsi="宋体" w:eastAsia="宋体"/>
           <w:sz w:val="21"/>
         </w:rPr>
-        <w:t>满分 100 分。建议将功能可用、业务产物和真实采纳相关指标作为主体，将安全合规、效率稳定性与成本可控作为支撑指标，避免评价被具体实现方式或模型参数牵引。</w:t>
+        <w:t>满分 100 分。建议将日常办公、典型表单、业务能力沉淀和任务闭环作为主体，将依据边界、采纳效率、运行保障和成本可控作为支撑指标，避免评价被具体实现方式或模型参数牵引。</w:t>
       </w:r>
     </w:p>
     <w:p>
@@ -1288,7 +1288,7 @@
                 <w:b w:val="0"/>
                 <w:sz w:val="16"/>
               </w:rPr>
-              <w:t>日常办公业务办理能力</w:t>
+              <w:t>日常办公业务办理与文档产出能力</w:t>
             </w:r>
           </w:p>
         </w:tc>
@@ -1348,7 +1348,7 @@
                 <w:b w:val="0"/>
                 <w:sz w:val="16"/>
               </w:rPr>
-              <w:t>制度问答与政策检索、会议纪要与记录整理、汇报与报告材料生成、请示方案与说明材料、整改清单与跟踪事项、办公流程辅助</w:t>
+              <w:t>制度问答、会议纪要、汇报材料、请示方案、整改清单、表格清单产物</w:t>
             </w:r>
           </w:p>
         </w:tc>
@@ -1378,7 +1378,7 @@
                 <w:b w:val="0"/>
                 <w:sz w:val="16"/>
               </w:rPr>
-              <w:t>办公任务输入输出、业务人员修改点、采纳情况</w:t>
+              <w:t>办公任务输入输出、文档初稿、业务人员修改点、采纳情况</w:t>
             </w:r>
           </w:p>
         </w:tc>
@@ -1473,7 +1473,7 @@
                 <w:b w:val="0"/>
                 <w:sz w:val="16"/>
               </w:rPr>
-              <w:t>流程表单理解、字段完整性校核、角色责任识别、流程节点与前后置条件、风险与合规提示、人工确认边界</w:t>
+              <w:t>工作票、操作票、检修计划、缺陷处理、角色责任、审批边界</w:t>
             </w:r>
           </w:p>
         </w:tc>
@@ -1504,7 +1504,7 @@
                 <w:b w:val="0"/>
                 <w:sz w:val="16"/>
               </w:rPr>
-              <w:t>样例表单审核意见、缺项清单、风险提示、人工确认记录</w:t>
+              <w:t>样例表单辅助检查意见、缺项清单、风险提示、人工确认记录</w:t>
             </w:r>
           </w:p>
         </w:tc>
@@ -1536,7 +1536,7 @@
                 <w:b w:val="0"/>
                 <w:sz w:val="16"/>
               </w:rPr>
-              <w:t>办公文档生成与格式规范能力</w:t>
+              <w:t>可复用业务能力沉淀能力</w:t>
             </w:r>
           </w:p>
         </w:tc>
@@ -1596,7 +1596,7 @@
                 <w:b w:val="0"/>
                 <w:sz w:val="16"/>
               </w:rPr>
-              <w:t>文档结构完整、格式规范性、公文与业务语气、表格与清单产物、少量修改可用</w:t>
+              <w:t>任务模板、检查清单、输出格式、业务规则复用、示例任务入口</w:t>
             </w:r>
           </w:p>
         </w:tc>
@@ -1626,7 +1626,7 @@
                 <w:b w:val="0"/>
                 <w:sz w:val="16"/>
               </w:rPr>
-              <w:t>文档初稿、格式检查、人工修改记录</w:t>
+              <w:t>业务能力模板、场景样例、复用记录、配置说明</w:t>
             </w:r>
           </w:p>
         </w:tc>
@@ -1659,7 +1659,7 @@
                 <w:b w:val="0"/>
                 <w:sz w:val="16"/>
               </w:rPr>
-              <w:t>可信依据与编造控制能力</w:t>
+              <w:t>多步骤任务闭环与过程留痕能力</w:t>
             </w:r>
           </w:p>
         </w:tc>
@@ -1721,7 +1721,7 @@
                 <w:b w:val="0"/>
                 <w:sz w:val="16"/>
               </w:rPr>
-              <w:t>引用与依据标注、事实一致性、待核验表达、编造控制、敏感信息处理</w:t>
+              <w:t>任务拆解、阶段状态、过程记录、产物清单、返工处理、后续建议</w:t>
             </w:r>
           </w:p>
         </w:tc>
@@ -1752,7 +1752,7 @@
                 <w:b w:val="0"/>
                 <w:sz w:val="16"/>
               </w:rPr>
-              <w:t>引用来源、错误记录、待核验事项、风险提示</w:t>
+              <w:t>阶段记录、最终产物、用户确认点、重做记录</w:t>
             </w:r>
           </w:p>
         </w:tc>
@@ -1784,7 +1784,7 @@
                 <w:b w:val="0"/>
                 <w:sz w:val="16"/>
               </w:rPr>
-              <w:t>任务闭环与过程可追踪能力</w:t>
+              <w:t>依据引用与风险边界表达能力</w:t>
             </w:r>
           </w:p>
         </w:tc>
@@ -1844,7 +1844,7 @@
                 <w:b w:val="0"/>
                 <w:sz w:val="16"/>
               </w:rPr>
-              <w:t>任务拆解、阶段状态与过程记录、产物沉淀、返工处理、闭环建议</w:t>
+              <w:t>依据标注、事实一致、待核验表达、风险提示、人工确认边界</w:t>
             </w:r>
           </w:p>
         </w:tc>
@@ -1874,7 +1874,7 @@
                 <w:b w:val="0"/>
                 <w:sz w:val="16"/>
               </w:rPr>
-              <w:t>阶段记录、最终产物、用户确认点、重做记录</w:t>
+              <w:t>引用来源、待核验事项、风险提示、复核记录</w:t>
             </w:r>
           </w:p>
         </w:tc>
@@ -1969,7 +1969,7 @@
                 <w:b w:val="0"/>
                 <w:sz w:val="16"/>
               </w:rPr>
-              <w:t>上手难度、交互清晰度、业务语言适配、修改成本、采纳反馈</w:t>
+              <w:t>上手难度、交互清晰度、业务语言、修改成本、采纳反馈</w:t>
             </w:r>
           </w:p>
         </w:tc>
@@ -2032,7 +2032,7 @@
                 <w:b w:val="0"/>
                 <w:sz w:val="16"/>
               </w:rPr>
-              <w:t>安全合规与交付适配能力</w:t>
+              <w:t>试用效率、稳定性与成本可控能力</w:t>
             </w:r>
           </w:p>
         </w:tc>
@@ -2092,7 +2092,7 @@
                 <w:b w:val="0"/>
                 <w:sz w:val="16"/>
               </w:rPr>
-              <w:t>终端与环境适配、数据安全说明、权限与审计、诊断与恢复、运维持续性</w:t>
+              <w:t>任务有效完成时间、一次可用率、失败与重试情况、资源与使用成本</w:t>
             </w:r>
           </w:p>
         </w:tc>
@@ -2122,7 +2122,7 @@
                 <w:b w:val="0"/>
                 <w:sz w:val="16"/>
               </w:rPr>
-              <w:t>安全说明、部署说明、诊断材料、运维记录</w:t>
+              <w:t>任务计时记录、一次通过记录、失败重试记录、成本说明</w:t>
             </w:r>
           </w:p>
         </w:tc>
@@ -2155,7 +2155,7 @@
                 <w:b w:val="0"/>
                 <w:sz w:val="16"/>
               </w:rPr>
-              <w:t>试用效率、稳定性与成本可控能力</w:t>
+              <w:t>实施适配与运行保障能力</w:t>
             </w:r>
           </w:p>
         </w:tc>
@@ -2217,7 +2217,7 @@
                 <w:b w:val="0"/>
                 <w:sz w:val="16"/>
               </w:rPr>
-              <w:t>任务有效完成时间、一次可用率、失败与重试情况、资源与使用成本</w:t>
+              <w:t>终端环境适配、资料处理边界、权限与留痕、诊断恢复、运维支持</w:t>
             </w:r>
           </w:p>
         </w:tc>
@@ -2248,7 +2248,7 @@
                 <w:b w:val="0"/>
                 <w:sz w:val="16"/>
               </w:rPr>
-              <w:t>任务计时记录、一次通过记录、失败重试记录、成本说明</w:t>
+              <w:t>实施说明、运行记录、诊断材料、支持记录</w:t>
             </w:r>
           </w:p>
         </w:tc>
@@ -2284,7 +2284,7 @@
           <w:color w:val="2F5597"/>
           <w:sz w:val="25"/>
         </w:rPr>
-        <w:t>6.1 日常办公业务办理能力（20 分）</w:t>
+        <w:t>6.1 日常办公业务办理与文档产出能力（20 分）</w:t>
       </w:r>
     </w:p>
     <w:tbl>
@@ -2425,7 +2425,7 @@
                 <w:b w:val="0"/>
                 <w:sz w:val="16"/>
               </w:rPr>
-              <w:t>制度问答与政策检索</w:t>
+              <w:t>制度问答与依据检索</w:t>
             </w:r>
           </w:p>
         </w:tc>
@@ -2455,7 +2455,7 @@
                 <w:b w:val="0"/>
                 <w:sz w:val="16"/>
               </w:rPr>
-              <w:t>4</w:t>
+              <w:t>3</w:t>
             </w:r>
           </w:p>
         </w:tc>
@@ -2892,7 +2892,7 @@
                 <w:b w:val="0"/>
                 <w:sz w:val="16"/>
               </w:rPr>
-              <w:t>办公流程辅助</w:t>
+              <w:t>表格与清单产物</w:t>
             </w:r>
           </w:p>
         </w:tc>
@@ -2923,7 +2923,7 @@
                 <w:b w:val="0"/>
                 <w:sz w:val="16"/>
               </w:rPr>
-              <w:t>3</w:t>
+              <w:t>4</w:t>
             </w:r>
           </w:p>
         </w:tc>
@@ -2954,13 +2954,52 @@
                 <w:b w:val="0"/>
                 <w:sz w:val="16"/>
               </w:rPr>
-              <w:t>能提示下一步办理事项、需补材料和人工确认点</w:t>
+              <w:t>能生成计划表、问题清单、责任矩阵、材料清单等可编辑表格</w:t>
             </w:r>
           </w:p>
         </w:tc>
       </w:tr>
     </w:tbl>
     <w:p/>
+    <w:p>
+      <w:pPr>
+        <w:spacing w:line="300" w:lineRule="auto" w:after="120"/>
+        <w:ind w:firstLine="420"/>
+      </w:pPr>
+      <w:r>
+        <w:rPr>
+          <w:rFonts w:ascii="宋体" w:hAnsi="宋体" w:eastAsia="宋体"/>
+          <w:sz w:val="21"/>
+        </w:rPr>
+        <w:t>高分特征：输出接近甲方日常办公材料形态，标题层级、段落表达、表格字段和责任事项清楚，业务人员少量修改即可使用。</w:t>
+      </w:r>
+    </w:p>
+    <w:p>
+      <w:pPr>
+        <w:spacing w:line="300" w:lineRule="auto" w:after="120"/>
+        <w:ind w:firstLine="420"/>
+      </w:pPr>
+      <w:r>
+        <w:rPr>
+          <w:rFonts w:ascii="宋体" w:hAnsi="宋体" w:eastAsia="宋体"/>
+          <w:sz w:val="21"/>
+        </w:rPr>
+        <w:t>低分特征：只给泛泛回答或普通聊天式建议，不能形成纪要、汇报、请示、方案、整改清单等可交付产物。</w:t>
+      </w:r>
+    </w:p>
+    <w:p>
+      <w:pPr>
+        <w:spacing w:line="300" w:lineRule="auto" w:after="120"/>
+        <w:ind w:firstLine="420"/>
+      </w:pPr>
+      <w:r>
+        <w:rPr>
+          <w:rFonts w:ascii="宋体" w:hAnsi="宋体" w:eastAsia="宋体"/>
+          <w:sz w:val="21"/>
+        </w:rPr>
+        <w:t>主要留证材料：原始输入、产品输出、人工修改稿、采纳情况、修改次数和修改耗时。</w:t>
+      </w:r>
+    </w:p>
     <w:p>
       <w:pPr>
         <w:pStyle w:val="Heading2"/>
@@ -3115,7 +3154,7 @@
                 <w:b w:val="0"/>
                 <w:sz w:val="16"/>
               </w:rPr>
-              <w:t>流程表单理解</w:t>
+              <w:t>典型表单识别与理解</w:t>
             </w:r>
           </w:p>
         </w:tc>
@@ -3175,7 +3214,7 @@
                 <w:b w:val="0"/>
                 <w:sz w:val="16"/>
               </w:rPr>
-              <w:t>能理解样例表单、制度条款、历史案例和附件材料之间的关系</w:t>
+              <w:t>能理解甲方指定的一单两票、检修计划、缺陷记录等典型表单材料</w:t>
             </w:r>
           </w:p>
         </w:tc>
@@ -3489,7 +3528,7 @@
                 <w:b w:val="0"/>
                 <w:sz w:val="16"/>
               </w:rPr>
-              <w:t>风险与合规提示</w:t>
+              <w:t>风险与缺项提示</w:t>
             </w:r>
           </w:p>
         </w:tc>
@@ -3653,6 +3692,45 @@
     <w:p/>
     <w:p>
       <w:pPr>
+        <w:spacing w:line="300" w:lineRule="auto" w:after="120"/>
+        <w:ind w:firstLine="420"/>
+      </w:pPr>
+      <w:r>
+        <w:rPr>
+          <w:rFonts w:ascii="宋体" w:hAnsi="宋体" w:eastAsia="宋体"/>
+          <w:sz w:val="21"/>
+        </w:rPr>
+        <w:t>高分特征：能把表单、制度、附件和历史材料关联起来，形成缺项清单、风险提示、修改建议和人工确认项，而不是只做文字润色。</w:t>
+      </w:r>
+    </w:p>
+    <w:p>
+      <w:pPr>
+        <w:spacing w:line="300" w:lineRule="auto" w:after="120"/>
+        <w:ind w:firstLine="420"/>
+      </w:pPr>
+      <w:r>
+        <w:rPr>
+          <w:rFonts w:ascii="宋体" w:hAnsi="宋体" w:eastAsia="宋体"/>
+          <w:sz w:val="21"/>
+        </w:rPr>
+        <w:t>低分特征：只识别表面文本错误，不能看出字段缺漏、角色责任、流程前后置条件或风险边界。</w:t>
+      </w:r>
+    </w:p>
+    <w:p>
+      <w:pPr>
+        <w:spacing w:line="300" w:lineRule="auto" w:after="120"/>
+        <w:ind w:firstLine="420"/>
+      </w:pPr>
+      <w:r>
+        <w:rPr>
+          <w:rFonts w:ascii="宋体" w:hAnsi="宋体" w:eastAsia="宋体"/>
+          <w:sz w:val="21"/>
+        </w:rPr>
+        <w:t>主要留证材料：样例表单、检查意见、缺项清单、风险提示、人工确认记录。</w:t>
+      </w:r>
+    </w:p>
+    <w:p>
+      <w:pPr>
         <w:pStyle w:val="Heading2"/>
         <w:spacing w:before="120" w:after="120"/>
         <w:ind w:firstLine="0"/>
@@ -3664,7 +3742,7 @@
           <w:color w:val="2F5597"/>
           <w:sz w:val="25"/>
         </w:rPr>
-        <w:t>6.3 办公文档生成与格式规范能力（15 分）</w:t>
+        <w:t>6.3 可复用业务能力沉淀能力（15 分）</w:t>
       </w:r>
     </w:p>
     <w:tbl>
@@ -3805,7 +3883,7 @@
                 <w:b w:val="0"/>
                 <w:sz w:val="16"/>
               </w:rPr>
-              <w:t>文档结构完整</w:t>
+              <w:t>高频任务模板化</w:t>
             </w:r>
           </w:p>
         </w:tc>
@@ -3835,7 +3913,7 @@
                 <w:b w:val="0"/>
                 <w:sz w:val="16"/>
               </w:rPr>
-              <w:t>3</w:t>
+              <w:t>4</w:t>
             </w:r>
           </w:p>
         </w:tc>
@@ -3865,7 +3943,7 @@
                 <w:b w:val="0"/>
                 <w:sz w:val="16"/>
               </w:rPr>
-              <w:t>输出包含标题、背景、依据、正文、结论或下一步等必要结构</w:t>
+              <w:t>能将制度问答、材料生成、表单辅助检查等高频任务沉淀为可复用模板</w:t>
             </w:r>
           </w:p>
         </w:tc>
@@ -3898,7 +3976,7 @@
                 <w:b w:val="0"/>
                 <w:sz w:val="16"/>
               </w:rPr>
-              <w:t>格式规范性</w:t>
+              <w:t>检查清单沉淀</w:t>
             </w:r>
           </w:p>
         </w:tc>
@@ -3960,7 +4038,7 @@
                 <w:b w:val="0"/>
                 <w:sz w:val="16"/>
               </w:rPr>
-              <w:t>标题层级、段落缩进、表格字段、编号和版面适合进入正式文档</w:t>
+              <w:t>能将字段完整性、风险点、责任分工、待核验事项沉淀为检查清单</w:t>
             </w:r>
           </w:p>
         </w:tc>
@@ -3992,7 +4070,7 @@
                 <w:b w:val="0"/>
                 <w:sz w:val="16"/>
               </w:rPr>
-              <w:t>公文与业务语气</w:t>
+              <w:t>输出格式复用</w:t>
             </w:r>
           </w:p>
         </w:tc>
@@ -4052,7 +4130,7 @@
                 <w:b w:val="0"/>
                 <w:sz w:val="16"/>
               </w:rPr>
-              <w:t>表达符合甲方日常办公、公文材料和部门沟通习惯</w:t>
+              <w:t>能复用纪要、汇报、请示、整改清单、审核意见等常用输出格式</w:t>
             </w:r>
           </w:p>
         </w:tc>
@@ -4085,7 +4163,7 @@
                 <w:b w:val="0"/>
                 <w:sz w:val="16"/>
               </w:rPr>
-              <w:t>表格与清单产物</w:t>
+              <w:t>业务规则复用</w:t>
             </w:r>
           </w:p>
         </w:tc>
@@ -4147,7 +4225,7 @@
                 <w:b w:val="0"/>
                 <w:sz w:val="16"/>
               </w:rPr>
-              <w:t>能生成计划表、问题清单、整改表、责任矩阵等可编辑表格</w:t>
+              <w:t>能复用甲方提供的制度口径、流程节点、角色责任和材料要求</w:t>
             </w:r>
           </w:p>
         </w:tc>
@@ -4179,7 +4257,7 @@
                 <w:b w:val="0"/>
                 <w:sz w:val="16"/>
               </w:rPr>
-              <w:t>少量修改可用</w:t>
+              <w:t>示例任务入口</w:t>
             </w:r>
           </w:p>
         </w:tc>
@@ -4209,7 +4287,7 @@
                 <w:b w:val="0"/>
                 <w:sz w:val="16"/>
               </w:rPr>
-              <w:t>3</w:t>
+              <w:t>2</w:t>
             </w:r>
           </w:p>
         </w:tc>
@@ -4239,13 +4317,52 @@
                 <w:b w:val="0"/>
                 <w:sz w:val="16"/>
               </w:rPr>
-              <w:t>业务人员少量修改后即可用于汇报、沟通、归档或办理</w:t>
+              <w:t>能为业务人员提供清晰的示例任务或任务入口，降低重复说明成本</w:t>
             </w:r>
           </w:p>
         </w:tc>
       </w:tr>
     </w:tbl>
     <w:p/>
+    <w:p>
+      <w:pPr>
+        <w:spacing w:line="300" w:lineRule="auto" w:after="120"/>
+        <w:ind w:firstLine="420"/>
+      </w:pPr>
+      <w:r>
+        <w:rPr>
+          <w:rFonts w:ascii="宋体" w:hAnsi="宋体" w:eastAsia="宋体"/>
+          <w:sz w:val="21"/>
+        </w:rPr>
+        <w:t>高分特征：同类任务再次试用时，不需要业务人员反复解释格式、字段和检查口径，产品能沿用已沉淀的任务模板和输出规范。</w:t>
+      </w:r>
+    </w:p>
+    <w:p>
+      <w:pPr>
+        <w:spacing w:line="300" w:lineRule="auto" w:after="120"/>
+        <w:ind w:firstLine="420"/>
+      </w:pPr>
+      <w:r>
+        <w:rPr>
+          <w:rFonts w:ascii="宋体" w:hAnsi="宋体" w:eastAsia="宋体"/>
+          <w:sz w:val="21"/>
+        </w:rPr>
+        <w:t>低分特征：每次任务都依赖临时提示，无法沉淀规则、清单和输出格式，换一个人员或任务就需要重新组织。</w:t>
+      </w:r>
+    </w:p>
+    <w:p>
+      <w:pPr>
+        <w:spacing w:line="300" w:lineRule="auto" w:after="120"/>
+        <w:ind w:firstLine="420"/>
+      </w:pPr>
+      <w:r>
+        <w:rPr>
+          <w:rFonts w:ascii="宋体" w:hAnsi="宋体" w:eastAsia="宋体"/>
+          <w:sz w:val="21"/>
+        </w:rPr>
+        <w:t>主要留证材料：业务能力模板、检查清单、示例任务、复用前后对比、配置说明。</w:t>
+      </w:r>
+    </w:p>
     <w:p>
       <w:pPr>
         <w:pStyle w:val="Heading2"/>
@@ -4259,602 +4376,7 @@
           <w:color w:val="2F5597"/>
           <w:sz w:val="25"/>
         </w:rPr>
-        <w:t>6.4 可信依据与编造控制能力（15 分）</w:t>
-      </w:r>
-    </w:p>
-    <w:tbl>
-      <w:tblPr>
-        <w:tblStyle w:val="TableGrid"/>
-        <w:tblW w:type="auto" w:w="0"/>
-        <w:jc w:val="center"/>
-        <w:tblLayout w:type="autofit"/>
-        <w:tblLook w:firstColumn="1" w:firstRow="1" w:lastColumn="0" w:lastRow="0" w:noHBand="0" w:noVBand="1" w:val="04A0"/>
-      </w:tblPr>
-      <w:tblGrid>
-        <w:gridCol w:w="4713"/>
-        <w:gridCol w:w="4713"/>
-        <w:gridCol w:w="4713"/>
-      </w:tblGrid>
-      <w:tr>
-        <w:tc>
-          <w:tcPr>
-            <w:tcW w:type="dxa" w:w="4713"/>
-            <w:vAlign w:val="center"/>
-            <w:tcBorders>
-              <w:top w:val="single" w:sz="6" w:space="0" w:color="B7C9D6"/>
-              <w:left w:val="single" w:sz="6" w:space="0" w:color="B7C9D6"/>
-              <w:bottom w:val="single" w:sz="6" w:space="0" w:color="B7C9D6"/>
-              <w:right w:val="single" w:sz="6" w:space="0" w:color="B7C9D6"/>
-              <w:insideH w:val="single" w:sz="6" w:space="0" w:color="B7C9D6"/>
-              <w:insideV w:val="single" w:sz="6" w:space="0" w:color="B7C9D6"/>
-            </w:tcBorders>
-            <w:shd w:fill="D9EAF7"/>
-          </w:tcPr>
-          <w:p>
-            <w:pPr>
-              <w:spacing w:after="0"/>
-              <w:ind w:firstLine="0"/>
-              <w:jc w:val="center"/>
-            </w:pPr>
-            <w:r/>
-            <w:r>
-              <w:rPr>
-                <w:rFonts w:ascii="宋体" w:hAnsi="宋体" w:eastAsia="宋体"/>
-                <w:b/>
-                <w:color w:val="1F4E79"/>
-                <w:sz w:val="16"/>
-              </w:rPr>
-              <w:t>二级指标</w:t>
-            </w:r>
-          </w:p>
-        </w:tc>
-        <w:tc>
-          <w:tcPr>
-            <w:tcW w:type="dxa" w:w="4713"/>
-            <w:vAlign w:val="center"/>
-            <w:tcBorders>
-              <w:top w:val="single" w:sz="6" w:space="0" w:color="B7C9D6"/>
-              <w:left w:val="single" w:sz="6" w:space="0" w:color="B7C9D6"/>
-              <w:bottom w:val="single" w:sz="6" w:space="0" w:color="B7C9D6"/>
-              <w:right w:val="single" w:sz="6" w:space="0" w:color="B7C9D6"/>
-              <w:insideH w:val="single" w:sz="6" w:space="0" w:color="B7C9D6"/>
-              <w:insideV w:val="single" w:sz="6" w:space="0" w:color="B7C9D6"/>
-            </w:tcBorders>
-            <w:shd w:fill="D9EAF7"/>
-          </w:tcPr>
-          <w:p>
-            <w:pPr>
-              <w:spacing w:after="0"/>
-              <w:ind w:firstLine="0"/>
-              <w:jc w:val="center"/>
-            </w:pPr>
-            <w:r/>
-            <w:r>
-              <w:rPr>
-                <w:rFonts w:ascii="宋体" w:hAnsi="宋体" w:eastAsia="宋体"/>
-                <w:b/>
-                <w:color w:val="1F4E79"/>
-                <w:sz w:val="16"/>
-              </w:rPr>
-              <w:t>分值</w:t>
-            </w:r>
-          </w:p>
-        </w:tc>
-        <w:tc>
-          <w:tcPr>
-            <w:tcW w:type="dxa" w:w="4713"/>
-            <w:vAlign w:val="center"/>
-            <w:tcBorders>
-              <w:top w:val="single" w:sz="6" w:space="0" w:color="B7C9D6"/>
-              <w:left w:val="single" w:sz="6" w:space="0" w:color="B7C9D6"/>
-              <w:bottom w:val="single" w:sz="6" w:space="0" w:color="B7C9D6"/>
-              <w:right w:val="single" w:sz="6" w:space="0" w:color="B7C9D6"/>
-              <w:insideH w:val="single" w:sz="6" w:space="0" w:color="B7C9D6"/>
-              <w:insideV w:val="single" w:sz="6" w:space="0" w:color="B7C9D6"/>
-            </w:tcBorders>
-            <w:shd w:fill="D9EAF7"/>
-          </w:tcPr>
-          <w:p>
-            <w:pPr>
-              <w:spacing w:after="0"/>
-              <w:ind w:firstLine="0"/>
-              <w:jc w:val="center"/>
-            </w:pPr>
-            <w:r/>
-            <w:r>
-              <w:rPr>
-                <w:rFonts w:ascii="宋体" w:hAnsi="宋体" w:eastAsia="宋体"/>
-                <w:b/>
-                <w:color w:val="1F4E79"/>
-                <w:sz w:val="16"/>
-              </w:rPr>
-              <w:t>评价口径</w:t>
-            </w:r>
-          </w:p>
-        </w:tc>
-      </w:tr>
-      <w:tr>
-        <w:tc>
-          <w:tcPr>
-            <w:tcW w:type="dxa" w:w="4713"/>
-            <w:vAlign w:val="center"/>
-            <w:tcBorders>
-              <w:top w:val="single" w:sz="6" w:space="0" w:color="B7C9D6"/>
-              <w:left w:val="single" w:sz="6" w:space="0" w:color="B7C9D6"/>
-              <w:bottom w:val="single" w:sz="6" w:space="0" w:color="B7C9D6"/>
-              <w:right w:val="single" w:sz="6" w:space="0" w:color="B7C9D6"/>
-              <w:insideH w:val="single" w:sz="6" w:space="0" w:color="B7C9D6"/>
-              <w:insideV w:val="single" w:sz="6" w:space="0" w:color="B7C9D6"/>
-            </w:tcBorders>
-          </w:tcPr>
-          <w:p>
-            <w:pPr>
-              <w:spacing w:after="0"/>
-              <w:ind w:firstLine="0"/>
-              <w:jc w:val="left"/>
-            </w:pPr>
-            <w:r/>
-            <w:r>
-              <w:rPr>
-                <w:rFonts w:ascii="宋体" w:hAnsi="宋体" w:eastAsia="宋体"/>
-                <w:b w:val="0"/>
-                <w:sz w:val="16"/>
-              </w:rPr>
-              <w:t>引用与依据标注</w:t>
-            </w:r>
-          </w:p>
-        </w:tc>
-        <w:tc>
-          <w:tcPr>
-            <w:tcW w:type="dxa" w:w="4713"/>
-            <w:vAlign w:val="center"/>
-            <w:tcBorders>
-              <w:top w:val="single" w:sz="6" w:space="0" w:color="B7C9D6"/>
-              <w:left w:val="single" w:sz="6" w:space="0" w:color="B7C9D6"/>
-              <w:bottom w:val="single" w:sz="6" w:space="0" w:color="B7C9D6"/>
-              <w:right w:val="single" w:sz="6" w:space="0" w:color="B7C9D6"/>
-              <w:insideH w:val="single" w:sz="6" w:space="0" w:color="B7C9D6"/>
-              <w:insideV w:val="single" w:sz="6" w:space="0" w:color="B7C9D6"/>
-            </w:tcBorders>
-          </w:tcPr>
-          <w:p>
-            <w:pPr>
-              <w:spacing w:after="0"/>
-              <w:ind w:firstLine="0"/>
-              <w:jc w:val="left"/>
-            </w:pPr>
-            <w:r/>
-            <w:r>
-              <w:rPr>
-                <w:rFonts w:ascii="宋体" w:hAnsi="宋体" w:eastAsia="宋体"/>
-                <w:b w:val="0"/>
-                <w:sz w:val="16"/>
-              </w:rPr>
-              <w:t>4</w:t>
-            </w:r>
-          </w:p>
-        </w:tc>
-        <w:tc>
-          <w:tcPr>
-            <w:tcW w:type="dxa" w:w="4713"/>
-            <w:vAlign w:val="center"/>
-            <w:tcBorders>
-              <w:top w:val="single" w:sz="6" w:space="0" w:color="B7C9D6"/>
-              <w:left w:val="single" w:sz="6" w:space="0" w:color="B7C9D6"/>
-              <w:bottom w:val="single" w:sz="6" w:space="0" w:color="B7C9D6"/>
-              <w:right w:val="single" w:sz="6" w:space="0" w:color="B7C9D6"/>
-              <w:insideH w:val="single" w:sz="6" w:space="0" w:color="B7C9D6"/>
-              <w:insideV w:val="single" w:sz="6" w:space="0" w:color="B7C9D6"/>
-            </w:tcBorders>
-          </w:tcPr>
-          <w:p>
-            <w:pPr>
-              <w:spacing w:after="0"/>
-              <w:ind w:firstLine="0"/>
-              <w:jc w:val="left"/>
-            </w:pPr>
-            <w:r/>
-            <w:r>
-              <w:rPr>
-                <w:rFonts w:ascii="宋体" w:hAnsi="宋体" w:eastAsia="宋体"/>
-                <w:b w:val="0"/>
-                <w:sz w:val="16"/>
-              </w:rPr>
-              <w:t>引用制度、规程、历史材料时说明来源、条款位置或材料出处</w:t>
-            </w:r>
-          </w:p>
-        </w:tc>
-      </w:tr>
-      <w:tr>
-        <w:tc>
-          <w:tcPr>
-            <w:tcW w:type="dxa" w:w="4713"/>
-            <w:vAlign w:val="center"/>
-            <w:tcBorders>
-              <w:top w:val="single" w:sz="6" w:space="0" w:color="B7C9D6"/>
-              <w:left w:val="single" w:sz="6" w:space="0" w:color="B7C9D6"/>
-              <w:bottom w:val="single" w:sz="6" w:space="0" w:color="B7C9D6"/>
-              <w:right w:val="single" w:sz="6" w:space="0" w:color="B7C9D6"/>
-              <w:insideH w:val="single" w:sz="6" w:space="0" w:color="B7C9D6"/>
-              <w:insideV w:val="single" w:sz="6" w:space="0" w:color="B7C9D6"/>
-            </w:tcBorders>
-            <w:shd w:fill="F8FBFD"/>
-          </w:tcPr>
-          <w:p>
-            <w:pPr>
-              <w:spacing w:after="0"/>
-              <w:ind w:firstLine="0"/>
-              <w:jc w:val="left"/>
-            </w:pPr>
-            <w:r/>
-            <w:r>
-              <w:rPr>
-                <w:rFonts w:ascii="宋体" w:hAnsi="宋体" w:eastAsia="宋体"/>
-                <w:b w:val="0"/>
-                <w:sz w:val="16"/>
-              </w:rPr>
-              <w:t>事实一致性</w:t>
-            </w:r>
-          </w:p>
-        </w:tc>
-        <w:tc>
-          <w:tcPr>
-            <w:tcW w:type="dxa" w:w="4713"/>
-            <w:vAlign w:val="center"/>
-            <w:tcBorders>
-              <w:top w:val="single" w:sz="6" w:space="0" w:color="B7C9D6"/>
-              <w:left w:val="single" w:sz="6" w:space="0" w:color="B7C9D6"/>
-              <w:bottom w:val="single" w:sz="6" w:space="0" w:color="B7C9D6"/>
-              <w:right w:val="single" w:sz="6" w:space="0" w:color="B7C9D6"/>
-              <w:insideH w:val="single" w:sz="6" w:space="0" w:color="B7C9D6"/>
-              <w:insideV w:val="single" w:sz="6" w:space="0" w:color="B7C9D6"/>
-            </w:tcBorders>
-            <w:shd w:fill="F8FBFD"/>
-          </w:tcPr>
-          <w:p>
-            <w:pPr>
-              <w:spacing w:after="0"/>
-              <w:ind w:firstLine="0"/>
-              <w:jc w:val="left"/>
-            </w:pPr>
-            <w:r/>
-            <w:r>
-              <w:rPr>
-                <w:rFonts w:ascii="宋体" w:hAnsi="宋体" w:eastAsia="宋体"/>
-                <w:b w:val="0"/>
-                <w:sz w:val="16"/>
-              </w:rPr>
-              <w:t>4</w:t>
-            </w:r>
-          </w:p>
-        </w:tc>
-        <w:tc>
-          <w:tcPr>
-            <w:tcW w:type="dxa" w:w="4713"/>
-            <w:vAlign w:val="center"/>
-            <w:tcBorders>
-              <w:top w:val="single" w:sz="6" w:space="0" w:color="B7C9D6"/>
-              <w:left w:val="single" w:sz="6" w:space="0" w:color="B7C9D6"/>
-              <w:bottom w:val="single" w:sz="6" w:space="0" w:color="B7C9D6"/>
-              <w:right w:val="single" w:sz="6" w:space="0" w:color="B7C9D6"/>
-              <w:insideH w:val="single" w:sz="6" w:space="0" w:color="B7C9D6"/>
-              <w:insideV w:val="single" w:sz="6" w:space="0" w:color="B7C9D6"/>
-            </w:tcBorders>
-            <w:shd w:fill="F8FBFD"/>
-          </w:tcPr>
-          <w:p>
-            <w:pPr>
-              <w:spacing w:after="0"/>
-              <w:ind w:firstLine="0"/>
-              <w:jc w:val="left"/>
-            </w:pPr>
-            <w:r/>
-            <w:r>
-              <w:rPr>
-                <w:rFonts w:ascii="宋体" w:hAnsi="宋体" w:eastAsia="宋体"/>
-                <w:b w:val="0"/>
-                <w:sz w:val="16"/>
-              </w:rPr>
-              <w:t>输出与甲方提供材料一致，不混用口径、不张冠李戴</w:t>
-            </w:r>
-          </w:p>
-        </w:tc>
-      </w:tr>
-      <w:tr>
-        <w:tc>
-          <w:tcPr>
-            <w:tcW w:type="dxa" w:w="4713"/>
-            <w:vAlign w:val="center"/>
-            <w:tcBorders>
-              <w:top w:val="single" w:sz="6" w:space="0" w:color="B7C9D6"/>
-              <w:left w:val="single" w:sz="6" w:space="0" w:color="B7C9D6"/>
-              <w:bottom w:val="single" w:sz="6" w:space="0" w:color="B7C9D6"/>
-              <w:right w:val="single" w:sz="6" w:space="0" w:color="B7C9D6"/>
-              <w:insideH w:val="single" w:sz="6" w:space="0" w:color="B7C9D6"/>
-              <w:insideV w:val="single" w:sz="6" w:space="0" w:color="B7C9D6"/>
-            </w:tcBorders>
-          </w:tcPr>
-          <w:p>
-            <w:pPr>
-              <w:spacing w:after="0"/>
-              <w:ind w:firstLine="0"/>
-              <w:jc w:val="left"/>
-            </w:pPr>
-            <w:r/>
-            <w:r>
-              <w:rPr>
-                <w:rFonts w:ascii="宋体" w:hAnsi="宋体" w:eastAsia="宋体"/>
-                <w:b w:val="0"/>
-                <w:sz w:val="16"/>
-              </w:rPr>
-              <w:t>待核验表达</w:t>
-            </w:r>
-          </w:p>
-        </w:tc>
-        <w:tc>
-          <w:tcPr>
-            <w:tcW w:type="dxa" w:w="4713"/>
-            <w:vAlign w:val="center"/>
-            <w:tcBorders>
-              <w:top w:val="single" w:sz="6" w:space="0" w:color="B7C9D6"/>
-              <w:left w:val="single" w:sz="6" w:space="0" w:color="B7C9D6"/>
-              <w:bottom w:val="single" w:sz="6" w:space="0" w:color="B7C9D6"/>
-              <w:right w:val="single" w:sz="6" w:space="0" w:color="B7C9D6"/>
-              <w:insideH w:val="single" w:sz="6" w:space="0" w:color="B7C9D6"/>
-              <w:insideV w:val="single" w:sz="6" w:space="0" w:color="B7C9D6"/>
-            </w:tcBorders>
-          </w:tcPr>
-          <w:p>
-            <w:pPr>
-              <w:spacing w:after="0"/>
-              <w:ind w:firstLine="0"/>
-              <w:jc w:val="left"/>
-            </w:pPr>
-            <w:r/>
-            <w:r>
-              <w:rPr>
-                <w:rFonts w:ascii="宋体" w:hAnsi="宋体" w:eastAsia="宋体"/>
-                <w:b w:val="0"/>
-                <w:sz w:val="16"/>
-              </w:rPr>
-              <w:t>3</w:t>
-            </w:r>
-          </w:p>
-        </w:tc>
-        <w:tc>
-          <w:tcPr>
-            <w:tcW w:type="dxa" w:w="4713"/>
-            <w:vAlign w:val="center"/>
-            <w:tcBorders>
-              <w:top w:val="single" w:sz="6" w:space="0" w:color="B7C9D6"/>
-              <w:left w:val="single" w:sz="6" w:space="0" w:color="B7C9D6"/>
-              <w:bottom w:val="single" w:sz="6" w:space="0" w:color="B7C9D6"/>
-              <w:right w:val="single" w:sz="6" w:space="0" w:color="B7C9D6"/>
-              <w:insideH w:val="single" w:sz="6" w:space="0" w:color="B7C9D6"/>
-              <w:insideV w:val="single" w:sz="6" w:space="0" w:color="B7C9D6"/>
-            </w:tcBorders>
-          </w:tcPr>
-          <w:p>
-            <w:pPr>
-              <w:spacing w:after="0"/>
-              <w:ind w:firstLine="0"/>
-              <w:jc w:val="left"/>
-            </w:pPr>
-            <w:r/>
-            <w:r>
-              <w:rPr>
-                <w:rFonts w:ascii="宋体" w:hAnsi="宋体" w:eastAsia="宋体"/>
-                <w:b w:val="0"/>
-                <w:sz w:val="16"/>
-              </w:rPr>
-              <w:t>对缺失信息、过期标准、无法确认事项标注待核验</w:t>
-            </w:r>
-          </w:p>
-        </w:tc>
-      </w:tr>
-      <w:tr>
-        <w:tc>
-          <w:tcPr>
-            <w:tcW w:type="dxa" w:w="4713"/>
-            <w:vAlign w:val="center"/>
-            <w:tcBorders>
-              <w:top w:val="single" w:sz="6" w:space="0" w:color="B7C9D6"/>
-              <w:left w:val="single" w:sz="6" w:space="0" w:color="B7C9D6"/>
-              <w:bottom w:val="single" w:sz="6" w:space="0" w:color="B7C9D6"/>
-              <w:right w:val="single" w:sz="6" w:space="0" w:color="B7C9D6"/>
-              <w:insideH w:val="single" w:sz="6" w:space="0" w:color="B7C9D6"/>
-              <w:insideV w:val="single" w:sz="6" w:space="0" w:color="B7C9D6"/>
-            </w:tcBorders>
-            <w:shd w:fill="F8FBFD"/>
-          </w:tcPr>
-          <w:p>
-            <w:pPr>
-              <w:spacing w:after="0"/>
-              <w:ind w:firstLine="0"/>
-              <w:jc w:val="left"/>
-            </w:pPr>
-            <w:r/>
-            <w:r>
-              <w:rPr>
-                <w:rFonts w:ascii="宋体" w:hAnsi="宋体" w:eastAsia="宋体"/>
-                <w:b w:val="0"/>
-                <w:sz w:val="16"/>
-              </w:rPr>
-              <w:t>编造控制</w:t>
-            </w:r>
-          </w:p>
-        </w:tc>
-        <w:tc>
-          <w:tcPr>
-            <w:tcW w:type="dxa" w:w="4713"/>
-            <w:vAlign w:val="center"/>
-            <w:tcBorders>
-              <w:top w:val="single" w:sz="6" w:space="0" w:color="B7C9D6"/>
-              <w:left w:val="single" w:sz="6" w:space="0" w:color="B7C9D6"/>
-              <w:bottom w:val="single" w:sz="6" w:space="0" w:color="B7C9D6"/>
-              <w:right w:val="single" w:sz="6" w:space="0" w:color="B7C9D6"/>
-              <w:insideH w:val="single" w:sz="6" w:space="0" w:color="B7C9D6"/>
-              <w:insideV w:val="single" w:sz="6" w:space="0" w:color="B7C9D6"/>
-            </w:tcBorders>
-            <w:shd w:fill="F8FBFD"/>
-          </w:tcPr>
-          <w:p>
-            <w:pPr>
-              <w:spacing w:after="0"/>
-              <w:ind w:firstLine="0"/>
-              <w:jc w:val="left"/>
-            </w:pPr>
-            <w:r/>
-            <w:r>
-              <w:rPr>
-                <w:rFonts w:ascii="宋体" w:hAnsi="宋体" w:eastAsia="宋体"/>
-                <w:b w:val="0"/>
-                <w:sz w:val="16"/>
-              </w:rPr>
-              <w:t>3</w:t>
-            </w:r>
-          </w:p>
-        </w:tc>
-        <w:tc>
-          <w:tcPr>
-            <w:tcW w:type="dxa" w:w="4713"/>
-            <w:vAlign w:val="center"/>
-            <w:tcBorders>
-              <w:top w:val="single" w:sz="6" w:space="0" w:color="B7C9D6"/>
-              <w:left w:val="single" w:sz="6" w:space="0" w:color="B7C9D6"/>
-              <w:bottom w:val="single" w:sz="6" w:space="0" w:color="B7C9D6"/>
-              <w:right w:val="single" w:sz="6" w:space="0" w:color="B7C9D6"/>
-              <w:insideH w:val="single" w:sz="6" w:space="0" w:color="B7C9D6"/>
-              <w:insideV w:val="single" w:sz="6" w:space="0" w:color="B7C9D6"/>
-            </w:tcBorders>
-            <w:shd w:fill="F8FBFD"/>
-          </w:tcPr>
-          <w:p>
-            <w:pPr>
-              <w:spacing w:after="0"/>
-              <w:ind w:firstLine="0"/>
-              <w:jc w:val="left"/>
-            </w:pPr>
-            <w:r/>
-            <w:r>
-              <w:rPr>
-                <w:rFonts w:ascii="宋体" w:hAnsi="宋体" w:eastAsia="宋体"/>
-                <w:b w:val="0"/>
-                <w:sz w:val="16"/>
-              </w:rPr>
-              <w:t>不编造政策、流程、设备状态、数据、审批结论或内部规则</w:t>
-            </w:r>
-          </w:p>
-        </w:tc>
-      </w:tr>
-      <w:tr>
-        <w:tc>
-          <w:tcPr>
-            <w:tcW w:type="dxa" w:w="4713"/>
-            <w:vAlign w:val="center"/>
-            <w:tcBorders>
-              <w:top w:val="single" w:sz="6" w:space="0" w:color="B7C9D6"/>
-              <w:left w:val="single" w:sz="6" w:space="0" w:color="B7C9D6"/>
-              <w:bottom w:val="single" w:sz="6" w:space="0" w:color="B7C9D6"/>
-              <w:right w:val="single" w:sz="6" w:space="0" w:color="B7C9D6"/>
-              <w:insideH w:val="single" w:sz="6" w:space="0" w:color="B7C9D6"/>
-              <w:insideV w:val="single" w:sz="6" w:space="0" w:color="B7C9D6"/>
-            </w:tcBorders>
-          </w:tcPr>
-          <w:p>
-            <w:pPr>
-              <w:spacing w:after="0"/>
-              <w:ind w:firstLine="0"/>
-              <w:jc w:val="left"/>
-            </w:pPr>
-            <w:r/>
-            <w:r>
-              <w:rPr>
-                <w:rFonts w:ascii="宋体" w:hAnsi="宋体" w:eastAsia="宋体"/>
-                <w:b w:val="0"/>
-                <w:sz w:val="16"/>
-              </w:rPr>
-              <w:t>敏感信息处理</w:t>
-            </w:r>
-          </w:p>
-        </w:tc>
-        <w:tc>
-          <w:tcPr>
-            <w:tcW w:type="dxa" w:w="4713"/>
-            <w:vAlign w:val="center"/>
-            <w:tcBorders>
-              <w:top w:val="single" w:sz="6" w:space="0" w:color="B7C9D6"/>
-              <w:left w:val="single" w:sz="6" w:space="0" w:color="B7C9D6"/>
-              <w:bottom w:val="single" w:sz="6" w:space="0" w:color="B7C9D6"/>
-              <w:right w:val="single" w:sz="6" w:space="0" w:color="B7C9D6"/>
-              <w:insideH w:val="single" w:sz="6" w:space="0" w:color="B7C9D6"/>
-              <w:insideV w:val="single" w:sz="6" w:space="0" w:color="B7C9D6"/>
-            </w:tcBorders>
-          </w:tcPr>
-          <w:p>
-            <w:pPr>
-              <w:spacing w:after="0"/>
-              <w:ind w:firstLine="0"/>
-              <w:jc w:val="left"/>
-            </w:pPr>
-            <w:r/>
-            <w:r>
-              <w:rPr>
-                <w:rFonts w:ascii="宋体" w:hAnsi="宋体" w:eastAsia="宋体"/>
-                <w:b w:val="0"/>
-                <w:sz w:val="16"/>
-              </w:rPr>
-              <w:t>1</w:t>
-            </w:r>
-          </w:p>
-        </w:tc>
-        <w:tc>
-          <w:tcPr>
-            <w:tcW w:type="dxa" w:w="4713"/>
-            <w:vAlign w:val="center"/>
-            <w:tcBorders>
-              <w:top w:val="single" w:sz="6" w:space="0" w:color="B7C9D6"/>
-              <w:left w:val="single" w:sz="6" w:space="0" w:color="B7C9D6"/>
-              <w:bottom w:val="single" w:sz="6" w:space="0" w:color="B7C9D6"/>
-              <w:right w:val="single" w:sz="6" w:space="0" w:color="B7C9D6"/>
-              <w:insideH w:val="single" w:sz="6" w:space="0" w:color="B7C9D6"/>
-              <w:insideV w:val="single" w:sz="6" w:space="0" w:color="B7C9D6"/>
-            </w:tcBorders>
-          </w:tcPr>
-          <w:p>
-            <w:pPr>
-              <w:spacing w:after="0"/>
-              <w:ind w:firstLine="0"/>
-              <w:jc w:val="left"/>
-            </w:pPr>
-            <w:r/>
-            <w:r>
-              <w:rPr>
-                <w:rFonts w:ascii="宋体" w:hAnsi="宋体" w:eastAsia="宋体"/>
-                <w:b w:val="0"/>
-                <w:sz w:val="16"/>
-              </w:rPr>
-              <w:t>不在输出中暴露不应公开的内部信息或敏感字段</w:t>
-            </w:r>
-          </w:p>
-        </w:tc>
-      </w:tr>
-    </w:tbl>
-    <w:p/>
-    <w:p>
-      <w:pPr>
-        <w:pStyle w:val="Heading2"/>
-        <w:spacing w:before="120" w:after="120"/>
-        <w:ind w:firstLine="0"/>
-      </w:pPr>
-      <w:r>
-        <w:rPr>
-          <w:rFonts w:ascii="黑体" w:hAnsi="黑体" w:eastAsia="黑体"/>
-          <w:b/>
-          <w:color w:val="2F5597"/>
-          <w:sz w:val="25"/>
-        </w:rPr>
-        <w:t>6.5 任务闭环与过程可追踪能力（12 分）</w:t>
+        <w:t>6.4 多步骤任务闭环与过程留痕能力（15 分）</w:t>
       </w:r>
     </w:p>
     <w:tbl>
@@ -5182,7 +4704,7 @@
                 <w:b w:val="0"/>
                 <w:sz w:val="16"/>
               </w:rPr>
-              <w:t>产物沉淀</w:t>
+              <w:t>产物清单与版本留存</w:t>
             </w:r>
           </w:p>
         </w:tc>
@@ -5212,7 +4734,7 @@
                 <w:b w:val="0"/>
                 <w:sz w:val="16"/>
               </w:rPr>
-              <w:t>2</w:t>
+              <w:t>3</w:t>
             </w:r>
           </w:p>
         </w:tc>
@@ -5306,7 +4828,7 @@
                 <w:b w:val="0"/>
                 <w:sz w:val="16"/>
               </w:rPr>
-              <w:t>2</w:t>
+              <w:t>3</w:t>
             </w:r>
           </w:p>
         </w:tc>
@@ -5369,7 +4891,454 @@
                 <w:b w:val="0"/>
                 <w:sz w:val="16"/>
               </w:rPr>
-              <w:t>闭环建议</w:t>
+              <w:t>后续办理建议</w:t>
+            </w:r>
+          </w:p>
+        </w:tc>
+        <w:tc>
+          <w:tcPr>
+            <w:tcW w:type="dxa" w:w="4713"/>
+            <w:vAlign w:val="center"/>
+            <w:tcBorders>
+              <w:top w:val="single" w:sz="6" w:space="0" w:color="B7C9D6"/>
+              <w:left w:val="single" w:sz="6" w:space="0" w:color="B7C9D6"/>
+              <w:bottom w:val="single" w:sz="6" w:space="0" w:color="B7C9D6"/>
+              <w:right w:val="single" w:sz="6" w:space="0" w:color="B7C9D6"/>
+              <w:insideH w:val="single" w:sz="6" w:space="0" w:color="B7C9D6"/>
+              <w:insideV w:val="single" w:sz="6" w:space="0" w:color="B7C9D6"/>
+            </w:tcBorders>
+          </w:tcPr>
+          <w:p>
+            <w:pPr>
+              <w:spacing w:after="0"/>
+              <w:ind w:firstLine="0"/>
+              <w:jc w:val="left"/>
+            </w:pPr>
+            <w:r/>
+            <w:r>
+              <w:rPr>
+                <w:rFonts w:ascii="宋体" w:hAnsi="宋体" w:eastAsia="宋体"/>
+                <w:b w:val="0"/>
+                <w:sz w:val="16"/>
+              </w:rPr>
+              <w:t>3</w:t>
+            </w:r>
+          </w:p>
+        </w:tc>
+        <w:tc>
+          <w:tcPr>
+            <w:tcW w:type="dxa" w:w="4713"/>
+            <w:vAlign w:val="center"/>
+            <w:tcBorders>
+              <w:top w:val="single" w:sz="6" w:space="0" w:color="B7C9D6"/>
+              <w:left w:val="single" w:sz="6" w:space="0" w:color="B7C9D6"/>
+              <w:bottom w:val="single" w:sz="6" w:space="0" w:color="B7C9D6"/>
+              <w:right w:val="single" w:sz="6" w:space="0" w:color="B7C9D6"/>
+              <w:insideH w:val="single" w:sz="6" w:space="0" w:color="B7C9D6"/>
+              <w:insideV w:val="single" w:sz="6" w:space="0" w:color="B7C9D6"/>
+            </w:tcBorders>
+          </w:tcPr>
+          <w:p>
+            <w:pPr>
+              <w:spacing w:after="0"/>
+              <w:ind w:firstLine="0"/>
+              <w:jc w:val="left"/>
+            </w:pPr>
+            <w:r/>
+            <w:r>
+              <w:rPr>
+                <w:rFonts w:ascii="宋体" w:hAnsi="宋体" w:eastAsia="宋体"/>
+                <w:b w:val="0"/>
+                <w:sz w:val="16"/>
+              </w:rPr>
+              <w:t>能给出后续办理、复核、整改、归档或复盘建议</w:t>
+            </w:r>
+          </w:p>
+        </w:tc>
+      </w:tr>
+    </w:tbl>
+    <w:p/>
+    <w:p>
+      <w:pPr>
+        <w:spacing w:line="300" w:lineRule="auto" w:after="120"/>
+        <w:ind w:firstLine="420"/>
+      </w:pPr>
+      <w:r>
+        <w:rPr>
+          <w:rFonts w:ascii="宋体" w:hAnsi="宋体" w:eastAsia="宋体"/>
+          <w:sz w:val="21"/>
+        </w:rPr>
+        <w:t>高分特征：产品不仅给一次性答案，还能持续推进任务，保留过程、产物和确认点，便于业务人员复核和接续办理。</w:t>
+      </w:r>
+    </w:p>
+    <w:p>
+      <w:pPr>
+        <w:spacing w:line="300" w:lineRule="auto" w:after="120"/>
+        <w:ind w:firstLine="420"/>
+      </w:pPr>
+      <w:r>
+        <w:rPr>
+          <w:rFonts w:ascii="宋体" w:hAnsi="宋体" w:eastAsia="宋体"/>
+          <w:sz w:val="21"/>
+        </w:rPr>
+        <w:t>低分特征：回答结束后没有阶段记录、没有产物清单，用户改口径或补材料后需要重新开始。</w:t>
+      </w:r>
+    </w:p>
+    <w:p>
+      <w:pPr>
+        <w:spacing w:line="300" w:lineRule="auto" w:after="120"/>
+        <w:ind w:firstLine="420"/>
+      </w:pPr>
+      <w:r>
+        <w:rPr>
+          <w:rFonts w:ascii="宋体" w:hAnsi="宋体" w:eastAsia="宋体"/>
+          <w:sz w:val="21"/>
+        </w:rPr>
+        <w:t>主要留证材料：阶段记录、产物清单、最终文件、用户确认点、返工记录。</w:t>
+      </w:r>
+    </w:p>
+    <w:p>
+      <w:pPr>
+        <w:pStyle w:val="Heading2"/>
+        <w:spacing w:before="120" w:after="120"/>
+        <w:ind w:firstLine="0"/>
+      </w:pPr>
+      <w:r>
+        <w:rPr>
+          <w:rFonts w:ascii="黑体" w:hAnsi="黑体" w:eastAsia="黑体"/>
+          <w:b/>
+          <w:color w:val="2F5597"/>
+          <w:sz w:val="25"/>
+        </w:rPr>
+        <w:t>6.5 依据引用与风险边界表达能力（12 分）</w:t>
+      </w:r>
+    </w:p>
+    <w:tbl>
+      <w:tblPr>
+        <w:tblStyle w:val="TableGrid"/>
+        <w:tblW w:type="auto" w:w="0"/>
+        <w:jc w:val="center"/>
+        <w:tblLayout w:type="autofit"/>
+        <w:tblLook w:firstColumn="1" w:firstRow="1" w:lastColumn="0" w:lastRow="0" w:noHBand="0" w:noVBand="1" w:val="04A0"/>
+      </w:tblPr>
+      <w:tblGrid>
+        <w:gridCol w:w="4713"/>
+        <w:gridCol w:w="4713"/>
+        <w:gridCol w:w="4713"/>
+      </w:tblGrid>
+      <w:tr>
+        <w:tc>
+          <w:tcPr>
+            <w:tcW w:type="dxa" w:w="4713"/>
+            <w:vAlign w:val="center"/>
+            <w:tcBorders>
+              <w:top w:val="single" w:sz="6" w:space="0" w:color="B7C9D6"/>
+              <w:left w:val="single" w:sz="6" w:space="0" w:color="B7C9D6"/>
+              <w:bottom w:val="single" w:sz="6" w:space="0" w:color="B7C9D6"/>
+              <w:right w:val="single" w:sz="6" w:space="0" w:color="B7C9D6"/>
+              <w:insideH w:val="single" w:sz="6" w:space="0" w:color="B7C9D6"/>
+              <w:insideV w:val="single" w:sz="6" w:space="0" w:color="B7C9D6"/>
+            </w:tcBorders>
+            <w:shd w:fill="D9EAF7"/>
+          </w:tcPr>
+          <w:p>
+            <w:pPr>
+              <w:spacing w:after="0"/>
+              <w:ind w:firstLine="0"/>
+              <w:jc w:val="center"/>
+            </w:pPr>
+            <w:r/>
+            <w:r>
+              <w:rPr>
+                <w:rFonts w:ascii="宋体" w:hAnsi="宋体" w:eastAsia="宋体"/>
+                <w:b/>
+                <w:color w:val="1F4E79"/>
+                <w:sz w:val="16"/>
+              </w:rPr>
+              <w:t>二级指标</w:t>
+            </w:r>
+          </w:p>
+        </w:tc>
+        <w:tc>
+          <w:tcPr>
+            <w:tcW w:type="dxa" w:w="4713"/>
+            <w:vAlign w:val="center"/>
+            <w:tcBorders>
+              <w:top w:val="single" w:sz="6" w:space="0" w:color="B7C9D6"/>
+              <w:left w:val="single" w:sz="6" w:space="0" w:color="B7C9D6"/>
+              <w:bottom w:val="single" w:sz="6" w:space="0" w:color="B7C9D6"/>
+              <w:right w:val="single" w:sz="6" w:space="0" w:color="B7C9D6"/>
+              <w:insideH w:val="single" w:sz="6" w:space="0" w:color="B7C9D6"/>
+              <w:insideV w:val="single" w:sz="6" w:space="0" w:color="B7C9D6"/>
+            </w:tcBorders>
+            <w:shd w:fill="D9EAF7"/>
+          </w:tcPr>
+          <w:p>
+            <w:pPr>
+              <w:spacing w:after="0"/>
+              <w:ind w:firstLine="0"/>
+              <w:jc w:val="center"/>
+            </w:pPr>
+            <w:r/>
+            <w:r>
+              <w:rPr>
+                <w:rFonts w:ascii="宋体" w:hAnsi="宋体" w:eastAsia="宋体"/>
+                <w:b/>
+                <w:color w:val="1F4E79"/>
+                <w:sz w:val="16"/>
+              </w:rPr>
+              <w:t>分值</w:t>
+            </w:r>
+          </w:p>
+        </w:tc>
+        <w:tc>
+          <w:tcPr>
+            <w:tcW w:type="dxa" w:w="4713"/>
+            <w:vAlign w:val="center"/>
+            <w:tcBorders>
+              <w:top w:val="single" w:sz="6" w:space="0" w:color="B7C9D6"/>
+              <w:left w:val="single" w:sz="6" w:space="0" w:color="B7C9D6"/>
+              <w:bottom w:val="single" w:sz="6" w:space="0" w:color="B7C9D6"/>
+              <w:right w:val="single" w:sz="6" w:space="0" w:color="B7C9D6"/>
+              <w:insideH w:val="single" w:sz="6" w:space="0" w:color="B7C9D6"/>
+              <w:insideV w:val="single" w:sz="6" w:space="0" w:color="B7C9D6"/>
+            </w:tcBorders>
+            <w:shd w:fill="D9EAF7"/>
+          </w:tcPr>
+          <w:p>
+            <w:pPr>
+              <w:spacing w:after="0"/>
+              <w:ind w:firstLine="0"/>
+              <w:jc w:val="center"/>
+            </w:pPr>
+            <w:r/>
+            <w:r>
+              <w:rPr>
+                <w:rFonts w:ascii="宋体" w:hAnsi="宋体" w:eastAsia="宋体"/>
+                <w:b/>
+                <w:color w:val="1F4E79"/>
+                <w:sz w:val="16"/>
+              </w:rPr>
+              <w:t>评价口径</w:t>
+            </w:r>
+          </w:p>
+        </w:tc>
+      </w:tr>
+      <w:tr>
+        <w:tc>
+          <w:tcPr>
+            <w:tcW w:type="dxa" w:w="4713"/>
+            <w:vAlign w:val="center"/>
+            <w:tcBorders>
+              <w:top w:val="single" w:sz="6" w:space="0" w:color="B7C9D6"/>
+              <w:left w:val="single" w:sz="6" w:space="0" w:color="B7C9D6"/>
+              <w:bottom w:val="single" w:sz="6" w:space="0" w:color="B7C9D6"/>
+              <w:right w:val="single" w:sz="6" w:space="0" w:color="B7C9D6"/>
+              <w:insideH w:val="single" w:sz="6" w:space="0" w:color="B7C9D6"/>
+              <w:insideV w:val="single" w:sz="6" w:space="0" w:color="B7C9D6"/>
+            </w:tcBorders>
+          </w:tcPr>
+          <w:p>
+            <w:pPr>
+              <w:spacing w:after="0"/>
+              <w:ind w:firstLine="0"/>
+              <w:jc w:val="left"/>
+            </w:pPr>
+            <w:r/>
+            <w:r>
+              <w:rPr>
+                <w:rFonts w:ascii="宋体" w:hAnsi="宋体" w:eastAsia="宋体"/>
+                <w:b w:val="0"/>
+                <w:sz w:val="16"/>
+              </w:rPr>
+              <w:t>引用与依据标注</w:t>
+            </w:r>
+          </w:p>
+        </w:tc>
+        <w:tc>
+          <w:tcPr>
+            <w:tcW w:type="dxa" w:w="4713"/>
+            <w:vAlign w:val="center"/>
+            <w:tcBorders>
+              <w:top w:val="single" w:sz="6" w:space="0" w:color="B7C9D6"/>
+              <w:left w:val="single" w:sz="6" w:space="0" w:color="B7C9D6"/>
+              <w:bottom w:val="single" w:sz="6" w:space="0" w:color="B7C9D6"/>
+              <w:right w:val="single" w:sz="6" w:space="0" w:color="B7C9D6"/>
+              <w:insideH w:val="single" w:sz="6" w:space="0" w:color="B7C9D6"/>
+              <w:insideV w:val="single" w:sz="6" w:space="0" w:color="B7C9D6"/>
+            </w:tcBorders>
+          </w:tcPr>
+          <w:p>
+            <w:pPr>
+              <w:spacing w:after="0"/>
+              <w:ind w:firstLine="0"/>
+              <w:jc w:val="left"/>
+            </w:pPr>
+            <w:r/>
+            <w:r>
+              <w:rPr>
+                <w:rFonts w:ascii="宋体" w:hAnsi="宋体" w:eastAsia="宋体"/>
+                <w:b w:val="0"/>
+                <w:sz w:val="16"/>
+              </w:rPr>
+              <w:t>3</w:t>
+            </w:r>
+          </w:p>
+        </w:tc>
+        <w:tc>
+          <w:tcPr>
+            <w:tcW w:type="dxa" w:w="4713"/>
+            <w:vAlign w:val="center"/>
+            <w:tcBorders>
+              <w:top w:val="single" w:sz="6" w:space="0" w:color="B7C9D6"/>
+              <w:left w:val="single" w:sz="6" w:space="0" w:color="B7C9D6"/>
+              <w:bottom w:val="single" w:sz="6" w:space="0" w:color="B7C9D6"/>
+              <w:right w:val="single" w:sz="6" w:space="0" w:color="B7C9D6"/>
+              <w:insideH w:val="single" w:sz="6" w:space="0" w:color="B7C9D6"/>
+              <w:insideV w:val="single" w:sz="6" w:space="0" w:color="B7C9D6"/>
+            </w:tcBorders>
+          </w:tcPr>
+          <w:p>
+            <w:pPr>
+              <w:spacing w:after="0"/>
+              <w:ind w:firstLine="0"/>
+              <w:jc w:val="left"/>
+            </w:pPr>
+            <w:r/>
+            <w:r>
+              <w:rPr>
+                <w:rFonts w:ascii="宋体" w:hAnsi="宋体" w:eastAsia="宋体"/>
+                <w:b w:val="0"/>
+                <w:sz w:val="16"/>
+              </w:rPr>
+              <w:t>引用制度、规程、历史材料时说明来源、条款位置或材料出处</w:t>
+            </w:r>
+          </w:p>
+        </w:tc>
+      </w:tr>
+      <w:tr>
+        <w:tc>
+          <w:tcPr>
+            <w:tcW w:type="dxa" w:w="4713"/>
+            <w:vAlign w:val="center"/>
+            <w:tcBorders>
+              <w:top w:val="single" w:sz="6" w:space="0" w:color="B7C9D6"/>
+              <w:left w:val="single" w:sz="6" w:space="0" w:color="B7C9D6"/>
+              <w:bottom w:val="single" w:sz="6" w:space="0" w:color="B7C9D6"/>
+              <w:right w:val="single" w:sz="6" w:space="0" w:color="B7C9D6"/>
+              <w:insideH w:val="single" w:sz="6" w:space="0" w:color="B7C9D6"/>
+              <w:insideV w:val="single" w:sz="6" w:space="0" w:color="B7C9D6"/>
+            </w:tcBorders>
+            <w:shd w:fill="F8FBFD"/>
+          </w:tcPr>
+          <w:p>
+            <w:pPr>
+              <w:spacing w:after="0"/>
+              <w:ind w:firstLine="0"/>
+              <w:jc w:val="left"/>
+            </w:pPr>
+            <w:r/>
+            <w:r>
+              <w:rPr>
+                <w:rFonts w:ascii="宋体" w:hAnsi="宋体" w:eastAsia="宋体"/>
+                <w:b w:val="0"/>
+                <w:sz w:val="16"/>
+              </w:rPr>
+              <w:t>事实一致性</w:t>
+            </w:r>
+          </w:p>
+        </w:tc>
+        <w:tc>
+          <w:tcPr>
+            <w:tcW w:type="dxa" w:w="4713"/>
+            <w:vAlign w:val="center"/>
+            <w:tcBorders>
+              <w:top w:val="single" w:sz="6" w:space="0" w:color="B7C9D6"/>
+              <w:left w:val="single" w:sz="6" w:space="0" w:color="B7C9D6"/>
+              <w:bottom w:val="single" w:sz="6" w:space="0" w:color="B7C9D6"/>
+              <w:right w:val="single" w:sz="6" w:space="0" w:color="B7C9D6"/>
+              <w:insideH w:val="single" w:sz="6" w:space="0" w:color="B7C9D6"/>
+              <w:insideV w:val="single" w:sz="6" w:space="0" w:color="B7C9D6"/>
+            </w:tcBorders>
+            <w:shd w:fill="F8FBFD"/>
+          </w:tcPr>
+          <w:p>
+            <w:pPr>
+              <w:spacing w:after="0"/>
+              <w:ind w:firstLine="0"/>
+              <w:jc w:val="left"/>
+            </w:pPr>
+            <w:r/>
+            <w:r>
+              <w:rPr>
+                <w:rFonts w:ascii="宋体" w:hAnsi="宋体" w:eastAsia="宋体"/>
+                <w:b w:val="0"/>
+                <w:sz w:val="16"/>
+              </w:rPr>
+              <w:t>3</w:t>
+            </w:r>
+          </w:p>
+        </w:tc>
+        <w:tc>
+          <w:tcPr>
+            <w:tcW w:type="dxa" w:w="4713"/>
+            <w:vAlign w:val="center"/>
+            <w:tcBorders>
+              <w:top w:val="single" w:sz="6" w:space="0" w:color="B7C9D6"/>
+              <w:left w:val="single" w:sz="6" w:space="0" w:color="B7C9D6"/>
+              <w:bottom w:val="single" w:sz="6" w:space="0" w:color="B7C9D6"/>
+              <w:right w:val="single" w:sz="6" w:space="0" w:color="B7C9D6"/>
+              <w:insideH w:val="single" w:sz="6" w:space="0" w:color="B7C9D6"/>
+              <w:insideV w:val="single" w:sz="6" w:space="0" w:color="B7C9D6"/>
+            </w:tcBorders>
+            <w:shd w:fill="F8FBFD"/>
+          </w:tcPr>
+          <w:p>
+            <w:pPr>
+              <w:spacing w:after="0"/>
+              <w:ind w:firstLine="0"/>
+              <w:jc w:val="left"/>
+            </w:pPr>
+            <w:r/>
+            <w:r>
+              <w:rPr>
+                <w:rFonts w:ascii="宋体" w:hAnsi="宋体" w:eastAsia="宋体"/>
+                <w:b w:val="0"/>
+                <w:sz w:val="16"/>
+              </w:rPr>
+              <w:t>输出与甲方提供材料一致，不混用口径、不张冠李戴</w:t>
+            </w:r>
+          </w:p>
+        </w:tc>
+      </w:tr>
+      <w:tr>
+        <w:tc>
+          <w:tcPr>
+            <w:tcW w:type="dxa" w:w="4713"/>
+            <w:vAlign w:val="center"/>
+            <w:tcBorders>
+              <w:top w:val="single" w:sz="6" w:space="0" w:color="B7C9D6"/>
+              <w:left w:val="single" w:sz="6" w:space="0" w:color="B7C9D6"/>
+              <w:bottom w:val="single" w:sz="6" w:space="0" w:color="B7C9D6"/>
+              <w:right w:val="single" w:sz="6" w:space="0" w:color="B7C9D6"/>
+              <w:insideH w:val="single" w:sz="6" w:space="0" w:color="B7C9D6"/>
+              <w:insideV w:val="single" w:sz="6" w:space="0" w:color="B7C9D6"/>
+            </w:tcBorders>
+          </w:tcPr>
+          <w:p>
+            <w:pPr>
+              <w:spacing w:after="0"/>
+              <w:ind w:firstLine="0"/>
+              <w:jc w:val="left"/>
+            </w:pPr>
+            <w:r/>
+            <w:r>
+              <w:rPr>
+                <w:rFonts w:ascii="宋体" w:hAnsi="宋体" w:eastAsia="宋体"/>
+                <w:b w:val="0"/>
+                <w:sz w:val="16"/>
+              </w:rPr>
+              <w:t>待核验表达</w:t>
             </w:r>
           </w:p>
         </w:tc>
@@ -5429,13 +5398,239 @@
                 <w:b w:val="0"/>
                 <w:sz w:val="16"/>
               </w:rPr>
-              <w:t>能给出后续办理、复核、整改、归档或复盘建议</w:t>
+              <w:t>对缺失信息、过期标准、无法确认事项标注待核验</w:t>
+            </w:r>
+          </w:p>
+        </w:tc>
+      </w:tr>
+      <w:tr>
+        <w:tc>
+          <w:tcPr>
+            <w:tcW w:type="dxa" w:w="4713"/>
+            <w:vAlign w:val="center"/>
+            <w:tcBorders>
+              <w:top w:val="single" w:sz="6" w:space="0" w:color="B7C9D6"/>
+              <w:left w:val="single" w:sz="6" w:space="0" w:color="B7C9D6"/>
+              <w:bottom w:val="single" w:sz="6" w:space="0" w:color="B7C9D6"/>
+              <w:right w:val="single" w:sz="6" w:space="0" w:color="B7C9D6"/>
+              <w:insideH w:val="single" w:sz="6" w:space="0" w:color="B7C9D6"/>
+              <w:insideV w:val="single" w:sz="6" w:space="0" w:color="B7C9D6"/>
+            </w:tcBorders>
+            <w:shd w:fill="F8FBFD"/>
+          </w:tcPr>
+          <w:p>
+            <w:pPr>
+              <w:spacing w:after="0"/>
+              <w:ind w:firstLine="0"/>
+              <w:jc w:val="left"/>
+            </w:pPr>
+            <w:r/>
+            <w:r>
+              <w:rPr>
+                <w:rFonts w:ascii="宋体" w:hAnsi="宋体" w:eastAsia="宋体"/>
+                <w:b w:val="0"/>
+                <w:sz w:val="16"/>
+              </w:rPr>
+              <w:t>风险提示</w:t>
+            </w:r>
+          </w:p>
+        </w:tc>
+        <w:tc>
+          <w:tcPr>
+            <w:tcW w:type="dxa" w:w="4713"/>
+            <w:vAlign w:val="center"/>
+            <w:tcBorders>
+              <w:top w:val="single" w:sz="6" w:space="0" w:color="B7C9D6"/>
+              <w:left w:val="single" w:sz="6" w:space="0" w:color="B7C9D6"/>
+              <w:bottom w:val="single" w:sz="6" w:space="0" w:color="B7C9D6"/>
+              <w:right w:val="single" w:sz="6" w:space="0" w:color="B7C9D6"/>
+              <w:insideH w:val="single" w:sz="6" w:space="0" w:color="B7C9D6"/>
+              <w:insideV w:val="single" w:sz="6" w:space="0" w:color="B7C9D6"/>
+            </w:tcBorders>
+            <w:shd w:fill="F8FBFD"/>
+          </w:tcPr>
+          <w:p>
+            <w:pPr>
+              <w:spacing w:after="0"/>
+              <w:ind w:firstLine="0"/>
+              <w:jc w:val="left"/>
+            </w:pPr>
+            <w:r/>
+            <w:r>
+              <w:rPr>
+                <w:rFonts w:ascii="宋体" w:hAnsi="宋体" w:eastAsia="宋体"/>
+                <w:b w:val="0"/>
+                <w:sz w:val="16"/>
+              </w:rPr>
+              <w:t>2</w:t>
+            </w:r>
+          </w:p>
+        </w:tc>
+        <w:tc>
+          <w:tcPr>
+            <w:tcW w:type="dxa" w:w="4713"/>
+            <w:vAlign w:val="center"/>
+            <w:tcBorders>
+              <w:top w:val="single" w:sz="6" w:space="0" w:color="B7C9D6"/>
+              <w:left w:val="single" w:sz="6" w:space="0" w:color="B7C9D6"/>
+              <w:bottom w:val="single" w:sz="6" w:space="0" w:color="B7C9D6"/>
+              <w:right w:val="single" w:sz="6" w:space="0" w:color="B7C9D6"/>
+              <w:insideH w:val="single" w:sz="6" w:space="0" w:color="B7C9D6"/>
+              <w:insideV w:val="single" w:sz="6" w:space="0" w:color="B7C9D6"/>
+            </w:tcBorders>
+            <w:shd w:fill="F8FBFD"/>
+          </w:tcPr>
+          <w:p>
+            <w:pPr>
+              <w:spacing w:after="0"/>
+              <w:ind w:firstLine="0"/>
+              <w:jc w:val="left"/>
+            </w:pPr>
+            <w:r/>
+            <w:r>
+              <w:rPr>
+                <w:rFonts w:ascii="宋体" w:hAnsi="宋体" w:eastAsia="宋体"/>
+                <w:b w:val="0"/>
+                <w:sz w:val="16"/>
+              </w:rPr>
+              <w:t>对安全、合规、责任、材料缺失等风险作出审慎提示</w:t>
+            </w:r>
+          </w:p>
+        </w:tc>
+      </w:tr>
+      <w:tr>
+        <w:tc>
+          <w:tcPr>
+            <w:tcW w:type="dxa" w:w="4713"/>
+            <w:vAlign w:val="center"/>
+            <w:tcBorders>
+              <w:top w:val="single" w:sz="6" w:space="0" w:color="B7C9D6"/>
+              <w:left w:val="single" w:sz="6" w:space="0" w:color="B7C9D6"/>
+              <w:bottom w:val="single" w:sz="6" w:space="0" w:color="B7C9D6"/>
+              <w:right w:val="single" w:sz="6" w:space="0" w:color="B7C9D6"/>
+              <w:insideH w:val="single" w:sz="6" w:space="0" w:color="B7C9D6"/>
+              <w:insideV w:val="single" w:sz="6" w:space="0" w:color="B7C9D6"/>
+            </w:tcBorders>
+          </w:tcPr>
+          <w:p>
+            <w:pPr>
+              <w:spacing w:after="0"/>
+              <w:ind w:firstLine="0"/>
+              <w:jc w:val="left"/>
+            </w:pPr>
+            <w:r/>
+            <w:r>
+              <w:rPr>
+                <w:rFonts w:ascii="宋体" w:hAnsi="宋体" w:eastAsia="宋体"/>
+                <w:b w:val="0"/>
+                <w:sz w:val="16"/>
+              </w:rPr>
+              <w:t>人工确认边界</w:t>
+            </w:r>
+          </w:p>
+        </w:tc>
+        <w:tc>
+          <w:tcPr>
+            <w:tcW w:type="dxa" w:w="4713"/>
+            <w:vAlign w:val="center"/>
+            <w:tcBorders>
+              <w:top w:val="single" w:sz="6" w:space="0" w:color="B7C9D6"/>
+              <w:left w:val="single" w:sz="6" w:space="0" w:color="B7C9D6"/>
+              <w:bottom w:val="single" w:sz="6" w:space="0" w:color="B7C9D6"/>
+              <w:right w:val="single" w:sz="6" w:space="0" w:color="B7C9D6"/>
+              <w:insideH w:val="single" w:sz="6" w:space="0" w:color="B7C9D6"/>
+              <w:insideV w:val="single" w:sz="6" w:space="0" w:color="B7C9D6"/>
+            </w:tcBorders>
+          </w:tcPr>
+          <w:p>
+            <w:pPr>
+              <w:spacing w:after="0"/>
+              <w:ind w:firstLine="0"/>
+              <w:jc w:val="left"/>
+            </w:pPr>
+            <w:r/>
+            <w:r>
+              <w:rPr>
+                <w:rFonts w:ascii="宋体" w:hAnsi="宋体" w:eastAsia="宋体"/>
+                <w:b w:val="0"/>
+                <w:sz w:val="16"/>
+              </w:rPr>
+              <w:t>2</w:t>
+            </w:r>
+          </w:p>
+        </w:tc>
+        <w:tc>
+          <w:tcPr>
+            <w:tcW w:type="dxa" w:w="4713"/>
+            <w:vAlign w:val="center"/>
+            <w:tcBorders>
+              <w:top w:val="single" w:sz="6" w:space="0" w:color="B7C9D6"/>
+              <w:left w:val="single" w:sz="6" w:space="0" w:color="B7C9D6"/>
+              <w:bottom w:val="single" w:sz="6" w:space="0" w:color="B7C9D6"/>
+              <w:right w:val="single" w:sz="6" w:space="0" w:color="B7C9D6"/>
+              <w:insideH w:val="single" w:sz="6" w:space="0" w:color="B7C9D6"/>
+              <w:insideV w:val="single" w:sz="6" w:space="0" w:color="B7C9D6"/>
+            </w:tcBorders>
+          </w:tcPr>
+          <w:p>
+            <w:pPr>
+              <w:spacing w:after="0"/>
+              <w:ind w:firstLine="0"/>
+              <w:jc w:val="left"/>
+            </w:pPr>
+            <w:r/>
+            <w:r>
+              <w:rPr>
+                <w:rFonts w:ascii="宋体" w:hAnsi="宋体" w:eastAsia="宋体"/>
+                <w:b w:val="0"/>
+                <w:sz w:val="16"/>
+              </w:rPr>
+              <w:t>不替代审批、审核、安全确认和责任认定，必要时提示人工复核</w:t>
             </w:r>
           </w:p>
         </w:tc>
       </w:tr>
     </w:tbl>
     <w:p/>
+    <w:p>
+      <w:pPr>
+        <w:spacing w:line="300" w:lineRule="auto" w:after="120"/>
+        <w:ind w:firstLine="420"/>
+      </w:pPr>
+      <w:r>
+        <w:rPr>
+          <w:rFonts w:ascii="宋体" w:hAnsi="宋体" w:eastAsia="宋体"/>
+          <w:sz w:val="21"/>
+        </w:rPr>
+        <w:t>高分特征：关键结论能回到材料依据，风险和不确定事项说清楚，高风险场景不越过人工确认边界。</w:t>
+      </w:r>
+    </w:p>
+    <w:p>
+      <w:pPr>
+        <w:spacing w:line="300" w:lineRule="auto" w:after="120"/>
+        <w:ind w:firstLine="420"/>
+      </w:pPr>
+      <w:r>
+        <w:rPr>
+          <w:rFonts w:ascii="宋体" w:hAnsi="宋体" w:eastAsia="宋体"/>
+          <w:sz w:val="21"/>
+        </w:rPr>
+        <w:t>低分特征：输出听起来完整但依据不清，或把缺失信息、推测判断写成确定结论。</w:t>
+      </w:r>
+    </w:p>
+    <w:p>
+      <w:pPr>
+        <w:spacing w:line="300" w:lineRule="auto" w:after="120"/>
+        <w:ind w:firstLine="420"/>
+      </w:pPr>
+      <w:r>
+        <w:rPr>
+          <w:rFonts w:ascii="宋体" w:hAnsi="宋体" w:eastAsia="宋体"/>
+          <w:sz w:val="21"/>
+        </w:rPr>
+        <w:t>主要留证材料：引用来源、待核验事项、风险提示、人工复核记录。</w:t>
+      </w:r>
+    </w:p>
     <w:p>
       <w:pPr>
         <w:pStyle w:val="Heading2"/>
@@ -6033,599 +6228,43 @@
     <w:p/>
     <w:p>
       <w:pPr>
-        <w:pStyle w:val="Heading2"/>
-        <w:spacing w:before="120" w:after="120"/>
-        <w:ind w:firstLine="0"/>
+        <w:spacing w:line="300" w:lineRule="auto" w:after="120"/>
+        <w:ind w:firstLine="420"/>
       </w:pPr>
       <w:r>
         <w:rPr>
-          <w:rFonts w:ascii="黑体" w:hAnsi="黑体" w:eastAsia="黑体"/>
-          <w:b/>
-          <w:color w:val="2F5597"/>
-          <w:sz w:val="25"/>
+          <w:rFonts w:ascii="宋体" w:hAnsi="宋体" w:eastAsia="宋体"/>
+          <w:sz w:val="21"/>
         </w:rPr>
-        <w:t>6.7 安全合规与交付适配能力（5 分）</w:t>
+        <w:t>高分特征：业务人员不需要理解模型、插件或技术概念，能按日常工作任务直接使用，并愿意继续用于真实办公。</w:t>
       </w:r>
     </w:p>
-    <w:tbl>
-      <w:tblPr>
-        <w:tblStyle w:val="TableGrid"/>
-        <w:tblW w:type="auto" w:w="0"/>
-        <w:jc w:val="center"/>
-        <w:tblLayout w:type="autofit"/>
-        <w:tblLook w:firstColumn="1" w:firstRow="1" w:lastColumn="0" w:lastRow="0" w:noHBand="0" w:noVBand="1" w:val="04A0"/>
-      </w:tblPr>
-      <w:tblGrid>
-        <w:gridCol w:w="4713"/>
-        <w:gridCol w:w="4713"/>
-        <w:gridCol w:w="4713"/>
-      </w:tblGrid>
-      <w:tr>
-        <w:tc>
-          <w:tcPr>
-            <w:tcW w:type="dxa" w:w="4713"/>
-            <w:vAlign w:val="center"/>
-            <w:tcBorders>
-              <w:top w:val="single" w:sz="6" w:space="0" w:color="B7C9D6"/>
-              <w:left w:val="single" w:sz="6" w:space="0" w:color="B7C9D6"/>
-              <w:bottom w:val="single" w:sz="6" w:space="0" w:color="B7C9D6"/>
-              <w:right w:val="single" w:sz="6" w:space="0" w:color="B7C9D6"/>
-              <w:insideH w:val="single" w:sz="6" w:space="0" w:color="B7C9D6"/>
-              <w:insideV w:val="single" w:sz="6" w:space="0" w:color="B7C9D6"/>
-            </w:tcBorders>
-            <w:shd w:fill="D9EAF7"/>
-          </w:tcPr>
-          <w:p>
-            <w:pPr>
-              <w:spacing w:after="0"/>
-              <w:ind w:firstLine="0"/>
-              <w:jc w:val="center"/>
-            </w:pPr>
-            <w:r/>
-            <w:r>
-              <w:rPr>
-                <w:rFonts w:ascii="宋体" w:hAnsi="宋体" w:eastAsia="宋体"/>
-                <w:b/>
-                <w:color w:val="1F4E79"/>
-                <w:sz w:val="16"/>
-              </w:rPr>
-              <w:t>二级指标</w:t>
-            </w:r>
-          </w:p>
-        </w:tc>
-        <w:tc>
-          <w:tcPr>
-            <w:tcW w:type="dxa" w:w="4713"/>
-            <w:vAlign w:val="center"/>
-            <w:tcBorders>
-              <w:top w:val="single" w:sz="6" w:space="0" w:color="B7C9D6"/>
-              <w:left w:val="single" w:sz="6" w:space="0" w:color="B7C9D6"/>
-              <w:bottom w:val="single" w:sz="6" w:space="0" w:color="B7C9D6"/>
-              <w:right w:val="single" w:sz="6" w:space="0" w:color="B7C9D6"/>
-              <w:insideH w:val="single" w:sz="6" w:space="0" w:color="B7C9D6"/>
-              <w:insideV w:val="single" w:sz="6" w:space="0" w:color="B7C9D6"/>
-            </w:tcBorders>
-            <w:shd w:fill="D9EAF7"/>
-          </w:tcPr>
-          <w:p>
-            <w:pPr>
-              <w:spacing w:after="0"/>
-              <w:ind w:firstLine="0"/>
-              <w:jc w:val="center"/>
-            </w:pPr>
-            <w:r/>
-            <w:r>
-              <w:rPr>
-                <w:rFonts w:ascii="宋体" w:hAnsi="宋体" w:eastAsia="宋体"/>
-                <w:b/>
-                <w:color w:val="1F4E79"/>
-                <w:sz w:val="16"/>
-              </w:rPr>
-              <w:t>分值</w:t>
-            </w:r>
-          </w:p>
-        </w:tc>
-        <w:tc>
-          <w:tcPr>
-            <w:tcW w:type="dxa" w:w="4713"/>
-            <w:vAlign w:val="center"/>
-            <w:tcBorders>
-              <w:top w:val="single" w:sz="6" w:space="0" w:color="B7C9D6"/>
-              <w:left w:val="single" w:sz="6" w:space="0" w:color="B7C9D6"/>
-              <w:bottom w:val="single" w:sz="6" w:space="0" w:color="B7C9D6"/>
-              <w:right w:val="single" w:sz="6" w:space="0" w:color="B7C9D6"/>
-              <w:insideH w:val="single" w:sz="6" w:space="0" w:color="B7C9D6"/>
-              <w:insideV w:val="single" w:sz="6" w:space="0" w:color="B7C9D6"/>
-            </w:tcBorders>
-            <w:shd w:fill="D9EAF7"/>
-          </w:tcPr>
-          <w:p>
-            <w:pPr>
-              <w:spacing w:after="0"/>
-              <w:ind w:firstLine="0"/>
-              <w:jc w:val="center"/>
-            </w:pPr>
-            <w:r/>
-            <w:r>
-              <w:rPr>
-                <w:rFonts w:ascii="宋体" w:hAnsi="宋体" w:eastAsia="宋体"/>
-                <w:b/>
-                <w:color w:val="1F4E79"/>
-                <w:sz w:val="16"/>
-              </w:rPr>
-              <w:t>评价口径</w:t>
-            </w:r>
-          </w:p>
-        </w:tc>
-      </w:tr>
-      <w:tr>
-        <w:tc>
-          <w:tcPr>
-            <w:tcW w:type="dxa" w:w="4713"/>
-            <w:vAlign w:val="center"/>
-            <w:tcBorders>
-              <w:top w:val="single" w:sz="6" w:space="0" w:color="B7C9D6"/>
-              <w:left w:val="single" w:sz="6" w:space="0" w:color="B7C9D6"/>
-              <w:bottom w:val="single" w:sz="6" w:space="0" w:color="B7C9D6"/>
-              <w:right w:val="single" w:sz="6" w:space="0" w:color="B7C9D6"/>
-              <w:insideH w:val="single" w:sz="6" w:space="0" w:color="B7C9D6"/>
-              <w:insideV w:val="single" w:sz="6" w:space="0" w:color="B7C9D6"/>
-            </w:tcBorders>
-          </w:tcPr>
-          <w:p>
-            <w:pPr>
-              <w:spacing w:after="0"/>
-              <w:ind w:firstLine="0"/>
-              <w:jc w:val="left"/>
-            </w:pPr>
-            <w:r/>
-            <w:r>
-              <w:rPr>
-                <w:rFonts w:ascii="宋体" w:hAnsi="宋体" w:eastAsia="宋体"/>
-                <w:b w:val="0"/>
-                <w:sz w:val="16"/>
-              </w:rPr>
-              <w:t>终端与环境适配</w:t>
-            </w:r>
-          </w:p>
-        </w:tc>
-        <w:tc>
-          <w:tcPr>
-            <w:tcW w:type="dxa" w:w="4713"/>
-            <w:vAlign w:val="center"/>
-            <w:tcBorders>
-              <w:top w:val="single" w:sz="6" w:space="0" w:color="B7C9D6"/>
-              <w:left w:val="single" w:sz="6" w:space="0" w:color="B7C9D6"/>
-              <w:bottom w:val="single" w:sz="6" w:space="0" w:color="B7C9D6"/>
-              <w:right w:val="single" w:sz="6" w:space="0" w:color="B7C9D6"/>
-              <w:insideH w:val="single" w:sz="6" w:space="0" w:color="B7C9D6"/>
-              <w:insideV w:val="single" w:sz="6" w:space="0" w:color="B7C9D6"/>
-            </w:tcBorders>
-          </w:tcPr>
-          <w:p>
-            <w:pPr>
-              <w:spacing w:after="0"/>
-              <w:ind w:firstLine="0"/>
-              <w:jc w:val="left"/>
-            </w:pPr>
-            <w:r/>
-            <w:r>
-              <w:rPr>
-                <w:rFonts w:ascii="宋体" w:hAnsi="宋体" w:eastAsia="宋体"/>
-                <w:b w:val="0"/>
-                <w:sz w:val="16"/>
-              </w:rPr>
-              <w:t>1</w:t>
-            </w:r>
-          </w:p>
-        </w:tc>
-        <w:tc>
-          <w:tcPr>
-            <w:tcW w:type="dxa" w:w="4713"/>
-            <w:vAlign w:val="center"/>
-            <w:tcBorders>
-              <w:top w:val="single" w:sz="6" w:space="0" w:color="B7C9D6"/>
-              <w:left w:val="single" w:sz="6" w:space="0" w:color="B7C9D6"/>
-              <w:bottom w:val="single" w:sz="6" w:space="0" w:color="B7C9D6"/>
-              <w:right w:val="single" w:sz="6" w:space="0" w:color="B7C9D6"/>
-              <w:insideH w:val="single" w:sz="6" w:space="0" w:color="B7C9D6"/>
-              <w:insideV w:val="single" w:sz="6" w:space="0" w:color="B7C9D6"/>
-            </w:tcBorders>
-          </w:tcPr>
-          <w:p>
-            <w:pPr>
-              <w:spacing w:after="0"/>
-              <w:ind w:firstLine="0"/>
-              <w:jc w:val="left"/>
-            </w:pPr>
-            <w:r/>
-            <w:r>
-              <w:rPr>
-                <w:rFonts w:ascii="宋体" w:hAnsi="宋体" w:eastAsia="宋体"/>
-                <w:b w:val="0"/>
-                <w:sz w:val="16"/>
-              </w:rPr>
-              <w:t>符合甲方办公终端、浏览器、操作系统和安全管控要求</w:t>
-            </w:r>
-          </w:p>
-        </w:tc>
-      </w:tr>
-      <w:tr>
-        <w:tc>
-          <w:tcPr>
-            <w:tcW w:type="dxa" w:w="4713"/>
-            <w:vAlign w:val="center"/>
-            <w:tcBorders>
-              <w:top w:val="single" w:sz="6" w:space="0" w:color="B7C9D6"/>
-              <w:left w:val="single" w:sz="6" w:space="0" w:color="B7C9D6"/>
-              <w:bottom w:val="single" w:sz="6" w:space="0" w:color="B7C9D6"/>
-              <w:right w:val="single" w:sz="6" w:space="0" w:color="B7C9D6"/>
-              <w:insideH w:val="single" w:sz="6" w:space="0" w:color="B7C9D6"/>
-              <w:insideV w:val="single" w:sz="6" w:space="0" w:color="B7C9D6"/>
-            </w:tcBorders>
-            <w:shd w:fill="F8FBFD"/>
-          </w:tcPr>
-          <w:p>
-            <w:pPr>
-              <w:spacing w:after="0"/>
-              <w:ind w:firstLine="0"/>
-              <w:jc w:val="left"/>
-            </w:pPr>
-            <w:r/>
-            <w:r>
-              <w:rPr>
-                <w:rFonts w:ascii="宋体" w:hAnsi="宋体" w:eastAsia="宋体"/>
-                <w:b w:val="0"/>
-                <w:sz w:val="16"/>
-              </w:rPr>
-              <w:t>数据安全说明</w:t>
-            </w:r>
-          </w:p>
-        </w:tc>
-        <w:tc>
-          <w:tcPr>
-            <w:tcW w:type="dxa" w:w="4713"/>
-            <w:vAlign w:val="center"/>
-            <w:tcBorders>
-              <w:top w:val="single" w:sz="6" w:space="0" w:color="B7C9D6"/>
-              <w:left w:val="single" w:sz="6" w:space="0" w:color="B7C9D6"/>
-              <w:bottom w:val="single" w:sz="6" w:space="0" w:color="B7C9D6"/>
-              <w:right w:val="single" w:sz="6" w:space="0" w:color="B7C9D6"/>
-              <w:insideH w:val="single" w:sz="6" w:space="0" w:color="B7C9D6"/>
-              <w:insideV w:val="single" w:sz="6" w:space="0" w:color="B7C9D6"/>
-            </w:tcBorders>
-            <w:shd w:fill="F8FBFD"/>
-          </w:tcPr>
-          <w:p>
-            <w:pPr>
-              <w:spacing w:after="0"/>
-              <w:ind w:firstLine="0"/>
-              <w:jc w:val="left"/>
-            </w:pPr>
-            <w:r/>
-            <w:r>
-              <w:rPr>
-                <w:rFonts w:ascii="宋体" w:hAnsi="宋体" w:eastAsia="宋体"/>
-                <w:b w:val="0"/>
-                <w:sz w:val="16"/>
-              </w:rPr>
-              <w:t>1</w:t>
-            </w:r>
-          </w:p>
-        </w:tc>
-        <w:tc>
-          <w:tcPr>
-            <w:tcW w:type="dxa" w:w="4713"/>
-            <w:vAlign w:val="center"/>
-            <w:tcBorders>
-              <w:top w:val="single" w:sz="6" w:space="0" w:color="B7C9D6"/>
-              <w:left w:val="single" w:sz="6" w:space="0" w:color="B7C9D6"/>
-              <w:bottom w:val="single" w:sz="6" w:space="0" w:color="B7C9D6"/>
-              <w:right w:val="single" w:sz="6" w:space="0" w:color="B7C9D6"/>
-              <w:insideH w:val="single" w:sz="6" w:space="0" w:color="B7C9D6"/>
-              <w:insideV w:val="single" w:sz="6" w:space="0" w:color="B7C9D6"/>
-            </w:tcBorders>
-            <w:shd w:fill="F8FBFD"/>
-          </w:tcPr>
-          <w:p>
-            <w:pPr>
-              <w:spacing w:after="0"/>
-              <w:ind w:firstLine="0"/>
-              <w:jc w:val="left"/>
-            </w:pPr>
-            <w:r/>
-            <w:r>
-              <w:rPr>
-                <w:rFonts w:ascii="宋体" w:hAnsi="宋体" w:eastAsia="宋体"/>
-                <w:b w:val="0"/>
-                <w:sz w:val="16"/>
-              </w:rPr>
-              <w:t>能说明数据存储、传输、外部调用和敏感资料处理方式</w:t>
-            </w:r>
-          </w:p>
-        </w:tc>
-      </w:tr>
-      <w:tr>
-        <w:tc>
-          <w:tcPr>
-            <w:tcW w:type="dxa" w:w="4713"/>
-            <w:vAlign w:val="center"/>
-            <w:tcBorders>
-              <w:top w:val="single" w:sz="6" w:space="0" w:color="B7C9D6"/>
-              <w:left w:val="single" w:sz="6" w:space="0" w:color="B7C9D6"/>
-              <w:bottom w:val="single" w:sz="6" w:space="0" w:color="B7C9D6"/>
-              <w:right w:val="single" w:sz="6" w:space="0" w:color="B7C9D6"/>
-              <w:insideH w:val="single" w:sz="6" w:space="0" w:color="B7C9D6"/>
-              <w:insideV w:val="single" w:sz="6" w:space="0" w:color="B7C9D6"/>
-            </w:tcBorders>
-          </w:tcPr>
-          <w:p>
-            <w:pPr>
-              <w:spacing w:after="0"/>
-              <w:ind w:firstLine="0"/>
-              <w:jc w:val="left"/>
-            </w:pPr>
-            <w:r/>
-            <w:r>
-              <w:rPr>
-                <w:rFonts w:ascii="宋体" w:hAnsi="宋体" w:eastAsia="宋体"/>
-                <w:b w:val="0"/>
-                <w:sz w:val="16"/>
-              </w:rPr>
-              <w:t>权限与审计</w:t>
-            </w:r>
-          </w:p>
-        </w:tc>
-        <w:tc>
-          <w:tcPr>
-            <w:tcW w:type="dxa" w:w="4713"/>
-            <w:vAlign w:val="center"/>
-            <w:tcBorders>
-              <w:top w:val="single" w:sz="6" w:space="0" w:color="B7C9D6"/>
-              <w:left w:val="single" w:sz="6" w:space="0" w:color="B7C9D6"/>
-              <w:bottom w:val="single" w:sz="6" w:space="0" w:color="B7C9D6"/>
-              <w:right w:val="single" w:sz="6" w:space="0" w:color="B7C9D6"/>
-              <w:insideH w:val="single" w:sz="6" w:space="0" w:color="B7C9D6"/>
-              <w:insideV w:val="single" w:sz="6" w:space="0" w:color="B7C9D6"/>
-            </w:tcBorders>
-          </w:tcPr>
-          <w:p>
-            <w:pPr>
-              <w:spacing w:after="0"/>
-              <w:ind w:firstLine="0"/>
-              <w:jc w:val="left"/>
-            </w:pPr>
-            <w:r/>
-            <w:r>
-              <w:rPr>
-                <w:rFonts w:ascii="宋体" w:hAnsi="宋体" w:eastAsia="宋体"/>
-                <w:b w:val="0"/>
-                <w:sz w:val="16"/>
-              </w:rPr>
-              <w:t>1</w:t>
-            </w:r>
-          </w:p>
-        </w:tc>
-        <w:tc>
-          <w:tcPr>
-            <w:tcW w:type="dxa" w:w="4713"/>
-            <w:vAlign w:val="center"/>
-            <w:tcBorders>
-              <w:top w:val="single" w:sz="6" w:space="0" w:color="B7C9D6"/>
-              <w:left w:val="single" w:sz="6" w:space="0" w:color="B7C9D6"/>
-              <w:bottom w:val="single" w:sz="6" w:space="0" w:color="B7C9D6"/>
-              <w:right w:val="single" w:sz="6" w:space="0" w:color="B7C9D6"/>
-              <w:insideH w:val="single" w:sz="6" w:space="0" w:color="B7C9D6"/>
-              <w:insideV w:val="single" w:sz="6" w:space="0" w:color="B7C9D6"/>
-            </w:tcBorders>
-          </w:tcPr>
-          <w:p>
-            <w:pPr>
-              <w:spacing w:after="0"/>
-              <w:ind w:firstLine="0"/>
-              <w:jc w:val="left"/>
-            </w:pPr>
-            <w:r/>
-            <w:r>
-              <w:rPr>
-                <w:rFonts w:ascii="宋体" w:hAnsi="宋体" w:eastAsia="宋体"/>
-                <w:b w:val="0"/>
-                <w:sz w:val="16"/>
-              </w:rPr>
-              <w:t>具备用户权限、操作记录、日志留存和必要审计能力</w:t>
-            </w:r>
-          </w:p>
-        </w:tc>
-      </w:tr>
-      <w:tr>
-        <w:tc>
-          <w:tcPr>
-            <w:tcW w:type="dxa" w:w="4713"/>
-            <w:vAlign w:val="center"/>
-            <w:tcBorders>
-              <w:top w:val="single" w:sz="6" w:space="0" w:color="B7C9D6"/>
-              <w:left w:val="single" w:sz="6" w:space="0" w:color="B7C9D6"/>
-              <w:bottom w:val="single" w:sz="6" w:space="0" w:color="B7C9D6"/>
-              <w:right w:val="single" w:sz="6" w:space="0" w:color="B7C9D6"/>
-              <w:insideH w:val="single" w:sz="6" w:space="0" w:color="B7C9D6"/>
-              <w:insideV w:val="single" w:sz="6" w:space="0" w:color="B7C9D6"/>
-            </w:tcBorders>
-            <w:shd w:fill="F8FBFD"/>
-          </w:tcPr>
-          <w:p>
-            <w:pPr>
-              <w:spacing w:after="0"/>
-              <w:ind w:firstLine="0"/>
-              <w:jc w:val="left"/>
-            </w:pPr>
-            <w:r/>
-            <w:r>
-              <w:rPr>
-                <w:rFonts w:ascii="宋体" w:hAnsi="宋体" w:eastAsia="宋体"/>
-                <w:b w:val="0"/>
-                <w:sz w:val="16"/>
-              </w:rPr>
-              <w:t>诊断与恢复</w:t>
-            </w:r>
-          </w:p>
-        </w:tc>
-        <w:tc>
-          <w:tcPr>
-            <w:tcW w:type="dxa" w:w="4713"/>
-            <w:vAlign w:val="center"/>
-            <w:tcBorders>
-              <w:top w:val="single" w:sz="6" w:space="0" w:color="B7C9D6"/>
-              <w:left w:val="single" w:sz="6" w:space="0" w:color="B7C9D6"/>
-              <w:bottom w:val="single" w:sz="6" w:space="0" w:color="B7C9D6"/>
-              <w:right w:val="single" w:sz="6" w:space="0" w:color="B7C9D6"/>
-              <w:insideH w:val="single" w:sz="6" w:space="0" w:color="B7C9D6"/>
-              <w:insideV w:val="single" w:sz="6" w:space="0" w:color="B7C9D6"/>
-            </w:tcBorders>
-            <w:shd w:fill="F8FBFD"/>
-          </w:tcPr>
-          <w:p>
-            <w:pPr>
-              <w:spacing w:after="0"/>
-              <w:ind w:firstLine="0"/>
-              <w:jc w:val="left"/>
-            </w:pPr>
-            <w:r/>
-            <w:r>
-              <w:rPr>
-                <w:rFonts w:ascii="宋体" w:hAnsi="宋体" w:eastAsia="宋体"/>
-                <w:b w:val="0"/>
-                <w:sz w:val="16"/>
-              </w:rPr>
-              <w:t>1</w:t>
-            </w:r>
-          </w:p>
-        </w:tc>
-        <w:tc>
-          <w:tcPr>
-            <w:tcW w:type="dxa" w:w="4713"/>
-            <w:vAlign w:val="center"/>
-            <w:tcBorders>
-              <w:top w:val="single" w:sz="6" w:space="0" w:color="B7C9D6"/>
-              <w:left w:val="single" w:sz="6" w:space="0" w:color="B7C9D6"/>
-              <w:bottom w:val="single" w:sz="6" w:space="0" w:color="B7C9D6"/>
-              <w:right w:val="single" w:sz="6" w:space="0" w:color="B7C9D6"/>
-              <w:insideH w:val="single" w:sz="6" w:space="0" w:color="B7C9D6"/>
-              <w:insideV w:val="single" w:sz="6" w:space="0" w:color="B7C9D6"/>
-            </w:tcBorders>
-            <w:shd w:fill="F8FBFD"/>
-          </w:tcPr>
-          <w:p>
-            <w:pPr>
-              <w:spacing w:after="0"/>
-              <w:ind w:firstLine="0"/>
-              <w:jc w:val="left"/>
-            </w:pPr>
-            <w:r/>
-            <w:r>
-              <w:rPr>
-                <w:rFonts w:ascii="宋体" w:hAnsi="宋体" w:eastAsia="宋体"/>
-                <w:b w:val="0"/>
-                <w:sz w:val="16"/>
-              </w:rPr>
-              <w:t>出现异常时便于定位问题、导出诊断信息和恢复使用</w:t>
-            </w:r>
-          </w:p>
-        </w:tc>
-      </w:tr>
-      <w:tr>
-        <w:tc>
-          <w:tcPr>
-            <w:tcW w:type="dxa" w:w="4713"/>
-            <w:vAlign w:val="center"/>
-            <w:tcBorders>
-              <w:top w:val="single" w:sz="6" w:space="0" w:color="B7C9D6"/>
-              <w:left w:val="single" w:sz="6" w:space="0" w:color="B7C9D6"/>
-              <w:bottom w:val="single" w:sz="6" w:space="0" w:color="B7C9D6"/>
-              <w:right w:val="single" w:sz="6" w:space="0" w:color="B7C9D6"/>
-              <w:insideH w:val="single" w:sz="6" w:space="0" w:color="B7C9D6"/>
-              <w:insideV w:val="single" w:sz="6" w:space="0" w:color="B7C9D6"/>
-            </w:tcBorders>
-          </w:tcPr>
-          <w:p>
-            <w:pPr>
-              <w:spacing w:after="0"/>
-              <w:ind w:firstLine="0"/>
-              <w:jc w:val="left"/>
-            </w:pPr>
-            <w:r/>
-            <w:r>
-              <w:rPr>
-                <w:rFonts w:ascii="宋体" w:hAnsi="宋体" w:eastAsia="宋体"/>
-                <w:b w:val="0"/>
-                <w:sz w:val="16"/>
-              </w:rPr>
-              <w:t>运维持续性</w:t>
-            </w:r>
-          </w:p>
-        </w:tc>
-        <w:tc>
-          <w:tcPr>
-            <w:tcW w:type="dxa" w:w="4713"/>
-            <w:vAlign w:val="center"/>
-            <w:tcBorders>
-              <w:top w:val="single" w:sz="6" w:space="0" w:color="B7C9D6"/>
-              <w:left w:val="single" w:sz="6" w:space="0" w:color="B7C9D6"/>
-              <w:bottom w:val="single" w:sz="6" w:space="0" w:color="B7C9D6"/>
-              <w:right w:val="single" w:sz="6" w:space="0" w:color="B7C9D6"/>
-              <w:insideH w:val="single" w:sz="6" w:space="0" w:color="B7C9D6"/>
-              <w:insideV w:val="single" w:sz="6" w:space="0" w:color="B7C9D6"/>
-            </w:tcBorders>
-          </w:tcPr>
-          <w:p>
-            <w:pPr>
-              <w:spacing w:after="0"/>
-              <w:ind w:firstLine="0"/>
-              <w:jc w:val="left"/>
-            </w:pPr>
-            <w:r/>
-            <w:r>
-              <w:rPr>
-                <w:rFonts w:ascii="宋体" w:hAnsi="宋体" w:eastAsia="宋体"/>
-                <w:b w:val="0"/>
-                <w:sz w:val="16"/>
-              </w:rPr>
-              <w:t>1</w:t>
-            </w:r>
-          </w:p>
-        </w:tc>
-        <w:tc>
-          <w:tcPr>
-            <w:tcW w:type="dxa" w:w="4713"/>
-            <w:vAlign w:val="center"/>
-            <w:tcBorders>
-              <w:top w:val="single" w:sz="6" w:space="0" w:color="B7C9D6"/>
-              <w:left w:val="single" w:sz="6" w:space="0" w:color="B7C9D6"/>
-              <w:bottom w:val="single" w:sz="6" w:space="0" w:color="B7C9D6"/>
-              <w:right w:val="single" w:sz="6" w:space="0" w:color="B7C9D6"/>
-              <w:insideH w:val="single" w:sz="6" w:space="0" w:color="B7C9D6"/>
-              <w:insideV w:val="single" w:sz="6" w:space="0" w:color="B7C9D6"/>
-            </w:tcBorders>
-          </w:tcPr>
-          <w:p>
-            <w:pPr>
-              <w:spacing w:after="0"/>
-              <w:ind w:firstLine="0"/>
-              <w:jc w:val="left"/>
-            </w:pPr>
-            <w:r/>
-            <w:r>
-              <w:rPr>
-                <w:rFonts w:ascii="宋体" w:hAnsi="宋体" w:eastAsia="宋体"/>
-                <w:b w:val="0"/>
-                <w:sz w:val="16"/>
-              </w:rPr>
-              <w:t>具备安装、升级、配置、备份、停用和支持服务方案</w:t>
-            </w:r>
-          </w:p>
-        </w:tc>
-      </w:tr>
-    </w:tbl>
-    <w:p/>
+    <w:p>
+      <w:pPr>
+        <w:spacing w:line="300" w:lineRule="auto" w:after="120"/>
+        <w:ind w:firstLine="420"/>
+      </w:pPr>
+      <w:r>
+        <w:rPr>
+          <w:rFonts w:ascii="宋体" w:hAnsi="宋体" w:eastAsia="宋体"/>
+          <w:sz w:val="21"/>
+        </w:rPr>
+        <w:t>低分特征：操作入口复杂，必须依赖技术人员解释，输出语言不符合甲方业务表达，修改成本仍然较高。</w:t>
+      </w:r>
+    </w:p>
+    <w:p>
+      <w:pPr>
+        <w:spacing w:line="300" w:lineRule="auto" w:after="120"/>
+        <w:ind w:firstLine="420"/>
+      </w:pPr>
+      <w:r>
+        <w:rPr>
+          <w:rFonts w:ascii="宋体" w:hAnsi="宋体" w:eastAsia="宋体"/>
+          <w:sz w:val="21"/>
+        </w:rPr>
+        <w:t>主要留证材料：试用人员评分、修改次数、修改耗时、满意度、采纳反馈。</w:t>
+      </w:r>
+    </w:p>
     <w:p>
       <w:pPr>
         <w:pStyle w:val="Heading2"/>
@@ -6639,7 +6278,7 @@
           <w:color w:val="2F5597"/>
           <w:sz w:val="25"/>
         </w:rPr>
-        <w:t>6.8 试用效率、稳定性与成本可控能力（5 分）</w:t>
+        <w:t>6.7 试用效率、稳定性与成本可控能力（5 分）</w:t>
       </w:r>
     </w:p>
     <w:tbl>
@@ -7131,6 +6770,679 @@
     <w:p/>
     <w:p>
       <w:pPr>
+        <w:spacing w:line="300" w:lineRule="auto" w:after="120"/>
+        <w:ind w:firstLine="420"/>
+      </w:pPr>
+      <w:r>
+        <w:rPr>
+          <w:rFonts w:ascii="宋体" w:hAnsi="宋体" w:eastAsia="宋体"/>
+          <w:sz w:val="21"/>
+        </w:rPr>
+        <w:t>高分特征：在统一任务、统一材料、统一评分口径下，产品能稳定完成任务，返工少，一次可用率较高。</w:t>
+      </w:r>
+    </w:p>
+    <w:p>
+      <w:pPr>
+        <w:spacing w:line="300" w:lineRule="auto" w:after="120"/>
+        <w:ind w:firstLine="420"/>
+      </w:pPr>
+      <w:r>
+        <w:rPr>
+          <w:rFonts w:ascii="宋体" w:hAnsi="宋体" w:eastAsia="宋体"/>
+          <w:sz w:val="21"/>
+        </w:rPr>
+        <w:t>低分特征：响应快但不可用，或频繁中断、重试、格式错乱，需要业务人员反复补救。</w:t>
+      </w:r>
+    </w:p>
+    <w:p>
+      <w:pPr>
+        <w:spacing w:line="300" w:lineRule="auto" w:after="120"/>
+        <w:ind w:firstLine="420"/>
+      </w:pPr>
+      <w:r>
+        <w:rPr>
+          <w:rFonts w:ascii="宋体" w:hAnsi="宋体" w:eastAsia="宋体"/>
+          <w:sz w:val="21"/>
+        </w:rPr>
+        <w:t>主要留证材料：任务计时记录、一次通过记录、失败重试记录、人工修改耗时、成本说明。</w:t>
+      </w:r>
+    </w:p>
+    <w:p>
+      <w:pPr>
+        <w:pStyle w:val="Heading2"/>
+        <w:spacing w:before="120" w:after="120"/>
+        <w:ind w:firstLine="0"/>
+      </w:pPr>
+      <w:r>
+        <w:rPr>
+          <w:rFonts w:ascii="黑体" w:hAnsi="黑体" w:eastAsia="黑体"/>
+          <w:b/>
+          <w:color w:val="2F5597"/>
+          <w:sz w:val="25"/>
+        </w:rPr>
+        <w:t>6.8 实施适配与运行保障能力（5 分）</w:t>
+      </w:r>
+    </w:p>
+    <w:tbl>
+      <w:tblPr>
+        <w:tblStyle w:val="TableGrid"/>
+        <w:tblW w:type="auto" w:w="0"/>
+        <w:jc w:val="center"/>
+        <w:tblLayout w:type="autofit"/>
+        <w:tblLook w:firstColumn="1" w:firstRow="1" w:lastColumn="0" w:lastRow="0" w:noHBand="0" w:noVBand="1" w:val="04A0"/>
+      </w:tblPr>
+      <w:tblGrid>
+        <w:gridCol w:w="4713"/>
+        <w:gridCol w:w="4713"/>
+        <w:gridCol w:w="4713"/>
+      </w:tblGrid>
+      <w:tr>
+        <w:tc>
+          <w:tcPr>
+            <w:tcW w:type="dxa" w:w="4713"/>
+            <w:vAlign w:val="center"/>
+            <w:tcBorders>
+              <w:top w:val="single" w:sz="6" w:space="0" w:color="B7C9D6"/>
+              <w:left w:val="single" w:sz="6" w:space="0" w:color="B7C9D6"/>
+              <w:bottom w:val="single" w:sz="6" w:space="0" w:color="B7C9D6"/>
+              <w:right w:val="single" w:sz="6" w:space="0" w:color="B7C9D6"/>
+              <w:insideH w:val="single" w:sz="6" w:space="0" w:color="B7C9D6"/>
+              <w:insideV w:val="single" w:sz="6" w:space="0" w:color="B7C9D6"/>
+            </w:tcBorders>
+            <w:shd w:fill="D9EAF7"/>
+          </w:tcPr>
+          <w:p>
+            <w:pPr>
+              <w:spacing w:after="0"/>
+              <w:ind w:firstLine="0"/>
+              <w:jc w:val="center"/>
+            </w:pPr>
+            <w:r/>
+            <w:r>
+              <w:rPr>
+                <w:rFonts w:ascii="宋体" w:hAnsi="宋体" w:eastAsia="宋体"/>
+                <w:b/>
+                <w:color w:val="1F4E79"/>
+                <w:sz w:val="16"/>
+              </w:rPr>
+              <w:t>二级指标</w:t>
+            </w:r>
+          </w:p>
+        </w:tc>
+        <w:tc>
+          <w:tcPr>
+            <w:tcW w:type="dxa" w:w="4713"/>
+            <w:vAlign w:val="center"/>
+            <w:tcBorders>
+              <w:top w:val="single" w:sz="6" w:space="0" w:color="B7C9D6"/>
+              <w:left w:val="single" w:sz="6" w:space="0" w:color="B7C9D6"/>
+              <w:bottom w:val="single" w:sz="6" w:space="0" w:color="B7C9D6"/>
+              <w:right w:val="single" w:sz="6" w:space="0" w:color="B7C9D6"/>
+              <w:insideH w:val="single" w:sz="6" w:space="0" w:color="B7C9D6"/>
+              <w:insideV w:val="single" w:sz="6" w:space="0" w:color="B7C9D6"/>
+            </w:tcBorders>
+            <w:shd w:fill="D9EAF7"/>
+          </w:tcPr>
+          <w:p>
+            <w:pPr>
+              <w:spacing w:after="0"/>
+              <w:ind w:firstLine="0"/>
+              <w:jc w:val="center"/>
+            </w:pPr>
+            <w:r/>
+            <w:r>
+              <w:rPr>
+                <w:rFonts w:ascii="宋体" w:hAnsi="宋体" w:eastAsia="宋体"/>
+                <w:b/>
+                <w:color w:val="1F4E79"/>
+                <w:sz w:val="16"/>
+              </w:rPr>
+              <w:t>分值</w:t>
+            </w:r>
+          </w:p>
+        </w:tc>
+        <w:tc>
+          <w:tcPr>
+            <w:tcW w:type="dxa" w:w="4713"/>
+            <w:vAlign w:val="center"/>
+            <w:tcBorders>
+              <w:top w:val="single" w:sz="6" w:space="0" w:color="B7C9D6"/>
+              <w:left w:val="single" w:sz="6" w:space="0" w:color="B7C9D6"/>
+              <w:bottom w:val="single" w:sz="6" w:space="0" w:color="B7C9D6"/>
+              <w:right w:val="single" w:sz="6" w:space="0" w:color="B7C9D6"/>
+              <w:insideH w:val="single" w:sz="6" w:space="0" w:color="B7C9D6"/>
+              <w:insideV w:val="single" w:sz="6" w:space="0" w:color="B7C9D6"/>
+            </w:tcBorders>
+            <w:shd w:fill="D9EAF7"/>
+          </w:tcPr>
+          <w:p>
+            <w:pPr>
+              <w:spacing w:after="0"/>
+              <w:ind w:firstLine="0"/>
+              <w:jc w:val="center"/>
+            </w:pPr>
+            <w:r/>
+            <w:r>
+              <w:rPr>
+                <w:rFonts w:ascii="宋体" w:hAnsi="宋体" w:eastAsia="宋体"/>
+                <w:b/>
+                <w:color w:val="1F4E79"/>
+                <w:sz w:val="16"/>
+              </w:rPr>
+              <w:t>评价口径</w:t>
+            </w:r>
+          </w:p>
+        </w:tc>
+      </w:tr>
+      <w:tr>
+        <w:tc>
+          <w:tcPr>
+            <w:tcW w:type="dxa" w:w="4713"/>
+            <w:vAlign w:val="center"/>
+            <w:tcBorders>
+              <w:top w:val="single" w:sz="6" w:space="0" w:color="B7C9D6"/>
+              <w:left w:val="single" w:sz="6" w:space="0" w:color="B7C9D6"/>
+              <w:bottom w:val="single" w:sz="6" w:space="0" w:color="B7C9D6"/>
+              <w:right w:val="single" w:sz="6" w:space="0" w:color="B7C9D6"/>
+              <w:insideH w:val="single" w:sz="6" w:space="0" w:color="B7C9D6"/>
+              <w:insideV w:val="single" w:sz="6" w:space="0" w:color="B7C9D6"/>
+            </w:tcBorders>
+          </w:tcPr>
+          <w:p>
+            <w:pPr>
+              <w:spacing w:after="0"/>
+              <w:ind w:firstLine="0"/>
+              <w:jc w:val="left"/>
+            </w:pPr>
+            <w:r/>
+            <w:r>
+              <w:rPr>
+                <w:rFonts w:ascii="宋体" w:hAnsi="宋体" w:eastAsia="宋体"/>
+                <w:b w:val="0"/>
+                <w:sz w:val="16"/>
+              </w:rPr>
+              <w:t>终端环境适配</w:t>
+            </w:r>
+          </w:p>
+        </w:tc>
+        <w:tc>
+          <w:tcPr>
+            <w:tcW w:type="dxa" w:w="4713"/>
+            <w:vAlign w:val="center"/>
+            <w:tcBorders>
+              <w:top w:val="single" w:sz="6" w:space="0" w:color="B7C9D6"/>
+              <w:left w:val="single" w:sz="6" w:space="0" w:color="B7C9D6"/>
+              <w:bottom w:val="single" w:sz="6" w:space="0" w:color="B7C9D6"/>
+              <w:right w:val="single" w:sz="6" w:space="0" w:color="B7C9D6"/>
+              <w:insideH w:val="single" w:sz="6" w:space="0" w:color="B7C9D6"/>
+              <w:insideV w:val="single" w:sz="6" w:space="0" w:color="B7C9D6"/>
+            </w:tcBorders>
+          </w:tcPr>
+          <w:p>
+            <w:pPr>
+              <w:spacing w:after="0"/>
+              <w:ind w:firstLine="0"/>
+              <w:jc w:val="left"/>
+            </w:pPr>
+            <w:r/>
+            <w:r>
+              <w:rPr>
+                <w:rFonts w:ascii="宋体" w:hAnsi="宋体" w:eastAsia="宋体"/>
+                <w:b w:val="0"/>
+                <w:sz w:val="16"/>
+              </w:rPr>
+              <w:t>1</w:t>
+            </w:r>
+          </w:p>
+        </w:tc>
+        <w:tc>
+          <w:tcPr>
+            <w:tcW w:type="dxa" w:w="4713"/>
+            <w:vAlign w:val="center"/>
+            <w:tcBorders>
+              <w:top w:val="single" w:sz="6" w:space="0" w:color="B7C9D6"/>
+              <w:left w:val="single" w:sz="6" w:space="0" w:color="B7C9D6"/>
+              <w:bottom w:val="single" w:sz="6" w:space="0" w:color="B7C9D6"/>
+              <w:right w:val="single" w:sz="6" w:space="0" w:color="B7C9D6"/>
+              <w:insideH w:val="single" w:sz="6" w:space="0" w:color="B7C9D6"/>
+              <w:insideV w:val="single" w:sz="6" w:space="0" w:color="B7C9D6"/>
+            </w:tcBorders>
+          </w:tcPr>
+          <w:p>
+            <w:pPr>
+              <w:spacing w:after="0"/>
+              <w:ind w:firstLine="0"/>
+              <w:jc w:val="left"/>
+            </w:pPr>
+            <w:r/>
+            <w:r>
+              <w:rPr>
+                <w:rFonts w:ascii="宋体" w:hAnsi="宋体" w:eastAsia="宋体"/>
+                <w:b w:val="0"/>
+                <w:sz w:val="16"/>
+              </w:rPr>
+              <w:t>能与甲方既有办公终端、浏览器、操作系统和桌面管控要求兼容</w:t>
+            </w:r>
+          </w:p>
+        </w:tc>
+      </w:tr>
+      <w:tr>
+        <w:tc>
+          <w:tcPr>
+            <w:tcW w:type="dxa" w:w="4713"/>
+            <w:vAlign w:val="center"/>
+            <w:tcBorders>
+              <w:top w:val="single" w:sz="6" w:space="0" w:color="B7C9D6"/>
+              <w:left w:val="single" w:sz="6" w:space="0" w:color="B7C9D6"/>
+              <w:bottom w:val="single" w:sz="6" w:space="0" w:color="B7C9D6"/>
+              <w:right w:val="single" w:sz="6" w:space="0" w:color="B7C9D6"/>
+              <w:insideH w:val="single" w:sz="6" w:space="0" w:color="B7C9D6"/>
+              <w:insideV w:val="single" w:sz="6" w:space="0" w:color="B7C9D6"/>
+            </w:tcBorders>
+            <w:shd w:fill="F8FBFD"/>
+          </w:tcPr>
+          <w:p>
+            <w:pPr>
+              <w:spacing w:after="0"/>
+              <w:ind w:firstLine="0"/>
+              <w:jc w:val="left"/>
+            </w:pPr>
+            <w:r/>
+            <w:r>
+              <w:rPr>
+                <w:rFonts w:ascii="宋体" w:hAnsi="宋体" w:eastAsia="宋体"/>
+                <w:b w:val="0"/>
+                <w:sz w:val="16"/>
+              </w:rPr>
+              <w:t>资料处理边界</w:t>
+            </w:r>
+          </w:p>
+        </w:tc>
+        <w:tc>
+          <w:tcPr>
+            <w:tcW w:type="dxa" w:w="4713"/>
+            <w:vAlign w:val="center"/>
+            <w:tcBorders>
+              <w:top w:val="single" w:sz="6" w:space="0" w:color="B7C9D6"/>
+              <w:left w:val="single" w:sz="6" w:space="0" w:color="B7C9D6"/>
+              <w:bottom w:val="single" w:sz="6" w:space="0" w:color="B7C9D6"/>
+              <w:right w:val="single" w:sz="6" w:space="0" w:color="B7C9D6"/>
+              <w:insideH w:val="single" w:sz="6" w:space="0" w:color="B7C9D6"/>
+              <w:insideV w:val="single" w:sz="6" w:space="0" w:color="B7C9D6"/>
+            </w:tcBorders>
+            <w:shd w:fill="F8FBFD"/>
+          </w:tcPr>
+          <w:p>
+            <w:pPr>
+              <w:spacing w:after="0"/>
+              <w:ind w:firstLine="0"/>
+              <w:jc w:val="left"/>
+            </w:pPr>
+            <w:r/>
+            <w:r>
+              <w:rPr>
+                <w:rFonts w:ascii="宋体" w:hAnsi="宋体" w:eastAsia="宋体"/>
+                <w:b w:val="0"/>
+                <w:sz w:val="16"/>
+              </w:rPr>
+              <w:t>1</w:t>
+            </w:r>
+          </w:p>
+        </w:tc>
+        <w:tc>
+          <w:tcPr>
+            <w:tcW w:type="dxa" w:w="4713"/>
+            <w:vAlign w:val="center"/>
+            <w:tcBorders>
+              <w:top w:val="single" w:sz="6" w:space="0" w:color="B7C9D6"/>
+              <w:left w:val="single" w:sz="6" w:space="0" w:color="B7C9D6"/>
+              <w:bottom w:val="single" w:sz="6" w:space="0" w:color="B7C9D6"/>
+              <w:right w:val="single" w:sz="6" w:space="0" w:color="B7C9D6"/>
+              <w:insideH w:val="single" w:sz="6" w:space="0" w:color="B7C9D6"/>
+              <w:insideV w:val="single" w:sz="6" w:space="0" w:color="B7C9D6"/>
+            </w:tcBorders>
+            <w:shd w:fill="F8FBFD"/>
+          </w:tcPr>
+          <w:p>
+            <w:pPr>
+              <w:spacing w:after="0"/>
+              <w:ind w:firstLine="0"/>
+              <w:jc w:val="left"/>
+            </w:pPr>
+            <w:r/>
+            <w:r>
+              <w:rPr>
+                <w:rFonts w:ascii="宋体" w:hAnsi="宋体" w:eastAsia="宋体"/>
+                <w:b w:val="0"/>
+                <w:sz w:val="16"/>
+              </w:rPr>
+              <w:t>能说明资料导入、存储、传输、外部调用和留存边界</w:t>
+            </w:r>
+          </w:p>
+        </w:tc>
+      </w:tr>
+      <w:tr>
+        <w:tc>
+          <w:tcPr>
+            <w:tcW w:type="dxa" w:w="4713"/>
+            <w:vAlign w:val="center"/>
+            <w:tcBorders>
+              <w:top w:val="single" w:sz="6" w:space="0" w:color="B7C9D6"/>
+              <w:left w:val="single" w:sz="6" w:space="0" w:color="B7C9D6"/>
+              <w:bottom w:val="single" w:sz="6" w:space="0" w:color="B7C9D6"/>
+              <w:right w:val="single" w:sz="6" w:space="0" w:color="B7C9D6"/>
+              <w:insideH w:val="single" w:sz="6" w:space="0" w:color="B7C9D6"/>
+              <w:insideV w:val="single" w:sz="6" w:space="0" w:color="B7C9D6"/>
+            </w:tcBorders>
+          </w:tcPr>
+          <w:p>
+            <w:pPr>
+              <w:spacing w:after="0"/>
+              <w:ind w:firstLine="0"/>
+              <w:jc w:val="left"/>
+            </w:pPr>
+            <w:r/>
+            <w:r>
+              <w:rPr>
+                <w:rFonts w:ascii="宋体" w:hAnsi="宋体" w:eastAsia="宋体"/>
+                <w:b w:val="0"/>
+                <w:sz w:val="16"/>
+              </w:rPr>
+              <w:t>权限与留痕</w:t>
+            </w:r>
+          </w:p>
+        </w:tc>
+        <w:tc>
+          <w:tcPr>
+            <w:tcW w:type="dxa" w:w="4713"/>
+            <w:vAlign w:val="center"/>
+            <w:tcBorders>
+              <w:top w:val="single" w:sz="6" w:space="0" w:color="B7C9D6"/>
+              <w:left w:val="single" w:sz="6" w:space="0" w:color="B7C9D6"/>
+              <w:bottom w:val="single" w:sz="6" w:space="0" w:color="B7C9D6"/>
+              <w:right w:val="single" w:sz="6" w:space="0" w:color="B7C9D6"/>
+              <w:insideH w:val="single" w:sz="6" w:space="0" w:color="B7C9D6"/>
+              <w:insideV w:val="single" w:sz="6" w:space="0" w:color="B7C9D6"/>
+            </w:tcBorders>
+          </w:tcPr>
+          <w:p>
+            <w:pPr>
+              <w:spacing w:after="0"/>
+              <w:ind w:firstLine="0"/>
+              <w:jc w:val="left"/>
+            </w:pPr>
+            <w:r/>
+            <w:r>
+              <w:rPr>
+                <w:rFonts w:ascii="宋体" w:hAnsi="宋体" w:eastAsia="宋体"/>
+                <w:b w:val="0"/>
+                <w:sz w:val="16"/>
+              </w:rPr>
+              <w:t>1</w:t>
+            </w:r>
+          </w:p>
+        </w:tc>
+        <w:tc>
+          <w:tcPr>
+            <w:tcW w:type="dxa" w:w="4713"/>
+            <w:vAlign w:val="center"/>
+            <w:tcBorders>
+              <w:top w:val="single" w:sz="6" w:space="0" w:color="B7C9D6"/>
+              <w:left w:val="single" w:sz="6" w:space="0" w:color="B7C9D6"/>
+              <w:bottom w:val="single" w:sz="6" w:space="0" w:color="B7C9D6"/>
+              <w:right w:val="single" w:sz="6" w:space="0" w:color="B7C9D6"/>
+              <w:insideH w:val="single" w:sz="6" w:space="0" w:color="B7C9D6"/>
+              <w:insideV w:val="single" w:sz="6" w:space="0" w:color="B7C9D6"/>
+            </w:tcBorders>
+          </w:tcPr>
+          <w:p>
+            <w:pPr>
+              <w:spacing w:after="0"/>
+              <w:ind w:firstLine="0"/>
+              <w:jc w:val="left"/>
+            </w:pPr>
+            <w:r/>
+            <w:r>
+              <w:rPr>
+                <w:rFonts w:ascii="宋体" w:hAnsi="宋体" w:eastAsia="宋体"/>
+                <w:b w:val="0"/>
+                <w:sz w:val="16"/>
+              </w:rPr>
+              <w:t>具备必要的用户权限、操作记录、日志留存或审计支持</w:t>
+            </w:r>
+          </w:p>
+        </w:tc>
+      </w:tr>
+      <w:tr>
+        <w:tc>
+          <w:tcPr>
+            <w:tcW w:type="dxa" w:w="4713"/>
+            <w:vAlign w:val="center"/>
+            <w:tcBorders>
+              <w:top w:val="single" w:sz="6" w:space="0" w:color="B7C9D6"/>
+              <w:left w:val="single" w:sz="6" w:space="0" w:color="B7C9D6"/>
+              <w:bottom w:val="single" w:sz="6" w:space="0" w:color="B7C9D6"/>
+              <w:right w:val="single" w:sz="6" w:space="0" w:color="B7C9D6"/>
+              <w:insideH w:val="single" w:sz="6" w:space="0" w:color="B7C9D6"/>
+              <w:insideV w:val="single" w:sz="6" w:space="0" w:color="B7C9D6"/>
+            </w:tcBorders>
+            <w:shd w:fill="F8FBFD"/>
+          </w:tcPr>
+          <w:p>
+            <w:pPr>
+              <w:spacing w:after="0"/>
+              <w:ind w:firstLine="0"/>
+              <w:jc w:val="left"/>
+            </w:pPr>
+            <w:r/>
+            <w:r>
+              <w:rPr>
+                <w:rFonts w:ascii="宋体" w:hAnsi="宋体" w:eastAsia="宋体"/>
+                <w:b w:val="0"/>
+                <w:sz w:val="16"/>
+              </w:rPr>
+              <w:t>诊断与恢复</w:t>
+            </w:r>
+          </w:p>
+        </w:tc>
+        <w:tc>
+          <w:tcPr>
+            <w:tcW w:type="dxa" w:w="4713"/>
+            <w:vAlign w:val="center"/>
+            <w:tcBorders>
+              <w:top w:val="single" w:sz="6" w:space="0" w:color="B7C9D6"/>
+              <w:left w:val="single" w:sz="6" w:space="0" w:color="B7C9D6"/>
+              <w:bottom w:val="single" w:sz="6" w:space="0" w:color="B7C9D6"/>
+              <w:right w:val="single" w:sz="6" w:space="0" w:color="B7C9D6"/>
+              <w:insideH w:val="single" w:sz="6" w:space="0" w:color="B7C9D6"/>
+              <w:insideV w:val="single" w:sz="6" w:space="0" w:color="B7C9D6"/>
+            </w:tcBorders>
+            <w:shd w:fill="F8FBFD"/>
+          </w:tcPr>
+          <w:p>
+            <w:pPr>
+              <w:spacing w:after="0"/>
+              <w:ind w:firstLine="0"/>
+              <w:jc w:val="left"/>
+            </w:pPr>
+            <w:r/>
+            <w:r>
+              <w:rPr>
+                <w:rFonts w:ascii="宋体" w:hAnsi="宋体" w:eastAsia="宋体"/>
+                <w:b w:val="0"/>
+                <w:sz w:val="16"/>
+              </w:rPr>
+              <w:t>1</w:t>
+            </w:r>
+          </w:p>
+        </w:tc>
+        <w:tc>
+          <w:tcPr>
+            <w:tcW w:type="dxa" w:w="4713"/>
+            <w:vAlign w:val="center"/>
+            <w:tcBorders>
+              <w:top w:val="single" w:sz="6" w:space="0" w:color="B7C9D6"/>
+              <w:left w:val="single" w:sz="6" w:space="0" w:color="B7C9D6"/>
+              <w:bottom w:val="single" w:sz="6" w:space="0" w:color="B7C9D6"/>
+              <w:right w:val="single" w:sz="6" w:space="0" w:color="B7C9D6"/>
+              <w:insideH w:val="single" w:sz="6" w:space="0" w:color="B7C9D6"/>
+              <w:insideV w:val="single" w:sz="6" w:space="0" w:color="B7C9D6"/>
+            </w:tcBorders>
+            <w:shd w:fill="F8FBFD"/>
+          </w:tcPr>
+          <w:p>
+            <w:pPr>
+              <w:spacing w:after="0"/>
+              <w:ind w:firstLine="0"/>
+              <w:jc w:val="left"/>
+            </w:pPr>
+            <w:r/>
+            <w:r>
+              <w:rPr>
+                <w:rFonts w:ascii="宋体" w:hAnsi="宋体" w:eastAsia="宋体"/>
+                <w:b w:val="0"/>
+                <w:sz w:val="16"/>
+              </w:rPr>
+              <w:t>出现异常时便于定位问题、导出诊断信息和恢复使用</w:t>
+            </w:r>
+          </w:p>
+        </w:tc>
+      </w:tr>
+      <w:tr>
+        <w:tc>
+          <w:tcPr>
+            <w:tcW w:type="dxa" w:w="4713"/>
+            <w:vAlign w:val="center"/>
+            <w:tcBorders>
+              <w:top w:val="single" w:sz="6" w:space="0" w:color="B7C9D6"/>
+              <w:left w:val="single" w:sz="6" w:space="0" w:color="B7C9D6"/>
+              <w:bottom w:val="single" w:sz="6" w:space="0" w:color="B7C9D6"/>
+              <w:right w:val="single" w:sz="6" w:space="0" w:color="B7C9D6"/>
+              <w:insideH w:val="single" w:sz="6" w:space="0" w:color="B7C9D6"/>
+              <w:insideV w:val="single" w:sz="6" w:space="0" w:color="B7C9D6"/>
+            </w:tcBorders>
+          </w:tcPr>
+          <w:p>
+            <w:pPr>
+              <w:spacing w:after="0"/>
+              <w:ind w:firstLine="0"/>
+              <w:jc w:val="left"/>
+            </w:pPr>
+            <w:r/>
+            <w:r>
+              <w:rPr>
+                <w:rFonts w:ascii="宋体" w:hAnsi="宋体" w:eastAsia="宋体"/>
+                <w:b w:val="0"/>
+                <w:sz w:val="16"/>
+              </w:rPr>
+              <w:t>运维支持</w:t>
+            </w:r>
+          </w:p>
+        </w:tc>
+        <w:tc>
+          <w:tcPr>
+            <w:tcW w:type="dxa" w:w="4713"/>
+            <w:vAlign w:val="center"/>
+            <w:tcBorders>
+              <w:top w:val="single" w:sz="6" w:space="0" w:color="B7C9D6"/>
+              <w:left w:val="single" w:sz="6" w:space="0" w:color="B7C9D6"/>
+              <w:bottom w:val="single" w:sz="6" w:space="0" w:color="B7C9D6"/>
+              <w:right w:val="single" w:sz="6" w:space="0" w:color="B7C9D6"/>
+              <w:insideH w:val="single" w:sz="6" w:space="0" w:color="B7C9D6"/>
+              <w:insideV w:val="single" w:sz="6" w:space="0" w:color="B7C9D6"/>
+            </w:tcBorders>
+          </w:tcPr>
+          <w:p>
+            <w:pPr>
+              <w:spacing w:after="0"/>
+              <w:ind w:firstLine="0"/>
+              <w:jc w:val="left"/>
+            </w:pPr>
+            <w:r/>
+            <w:r>
+              <w:rPr>
+                <w:rFonts w:ascii="宋体" w:hAnsi="宋体" w:eastAsia="宋体"/>
+                <w:b w:val="0"/>
+                <w:sz w:val="16"/>
+              </w:rPr>
+              <w:t>1</w:t>
+            </w:r>
+          </w:p>
+        </w:tc>
+        <w:tc>
+          <w:tcPr>
+            <w:tcW w:type="dxa" w:w="4713"/>
+            <w:vAlign w:val="center"/>
+            <w:tcBorders>
+              <w:top w:val="single" w:sz="6" w:space="0" w:color="B7C9D6"/>
+              <w:left w:val="single" w:sz="6" w:space="0" w:color="B7C9D6"/>
+              <w:bottom w:val="single" w:sz="6" w:space="0" w:color="B7C9D6"/>
+              <w:right w:val="single" w:sz="6" w:space="0" w:color="B7C9D6"/>
+              <w:insideH w:val="single" w:sz="6" w:space="0" w:color="B7C9D6"/>
+              <w:insideV w:val="single" w:sz="6" w:space="0" w:color="B7C9D6"/>
+            </w:tcBorders>
+          </w:tcPr>
+          <w:p>
+            <w:pPr>
+              <w:spacing w:after="0"/>
+              <w:ind w:firstLine="0"/>
+              <w:jc w:val="left"/>
+            </w:pPr>
+            <w:r/>
+            <w:r>
+              <w:rPr>
+                <w:rFonts w:ascii="宋体" w:hAnsi="宋体" w:eastAsia="宋体"/>
+                <w:b w:val="0"/>
+                <w:sz w:val="16"/>
+              </w:rPr>
+              <w:t>具备安装、升级、配置、备份、停用和支持服务方案</w:t>
+            </w:r>
+          </w:p>
+        </w:tc>
+      </w:tr>
+    </w:tbl>
+    <w:p/>
+    <w:p>
+      <w:pPr>
+        <w:spacing w:line="300" w:lineRule="auto" w:after="120"/>
+        <w:ind w:firstLine="420"/>
+      </w:pPr>
+      <w:r>
+        <w:rPr>
+          <w:rFonts w:ascii="宋体" w:hAnsi="宋体" w:eastAsia="宋体"/>
+          <w:sz w:val="21"/>
+        </w:rPr>
+        <w:t>高分特征：产品能在甲方既有办公和管控条件下试用，问题可诊断、可恢复，运行边界说明清楚。</w:t>
+      </w:r>
+    </w:p>
+    <w:p>
+      <w:pPr>
+        <w:spacing w:line="300" w:lineRule="auto" w:after="120"/>
+        <w:ind w:firstLine="420"/>
+      </w:pPr>
+      <w:r>
+        <w:rPr>
+          <w:rFonts w:ascii="宋体" w:hAnsi="宋体" w:eastAsia="宋体"/>
+          <w:sz w:val="21"/>
+        </w:rPr>
+        <w:t>低分特征：对终端环境、资料处理、权限留痕和异常恢复缺少说明，试用中出现问题后难以定位。</w:t>
+      </w:r>
+    </w:p>
+    <w:p>
+      <w:pPr>
+        <w:spacing w:line="300" w:lineRule="auto" w:after="120"/>
+        <w:ind w:firstLine="420"/>
+      </w:pPr>
+      <w:r>
+        <w:rPr>
+          <w:rFonts w:ascii="宋体" w:hAnsi="宋体" w:eastAsia="宋体"/>
+          <w:sz w:val="21"/>
+        </w:rPr>
+        <w:t>主要留证材料：实施说明、运行记录、诊断材料、支持记录。</w:t>
+      </w:r>
+    </w:p>
+    <w:p>
+      <w:pPr>
         <w:pStyle w:val="Heading1"/>
         <w:spacing w:before="160" w:after="120"/>
         <w:ind w:firstLine="0"/>
@@ -7296,7 +7608,7 @@
                 <w:b w:val="0"/>
                 <w:sz w:val="16"/>
               </w:rPr>
-              <w:t>制度问答与依据检索</w:t>
+              <w:t>日常办公文档生成</w:t>
             </w:r>
           </w:p>
         </w:tc>
@@ -7326,7 +7638,7 @@
                 <w:b w:val="0"/>
                 <w:sz w:val="16"/>
               </w:rPr>
-              <w:t>带依据的问答结果、待核验事项</w:t>
+              <w:t>纪要、汇报、请示、方案、整改清单</w:t>
             </w:r>
           </w:p>
         </w:tc>
@@ -7356,7 +7668,7 @@
                 <w:b w:val="0"/>
                 <w:sz w:val="16"/>
               </w:rPr>
-              <w:t>是否引用准确、边界清楚、不编造，是否能在合理时间内完成</w:t>
+              <w:t>是否结构规范、语气合适、少改可用，人工修改耗时是否减少</w:t>
             </w:r>
           </w:p>
         </w:tc>
@@ -7389,7 +7701,7 @@
                 <w:b w:val="0"/>
                 <w:sz w:val="16"/>
               </w:rPr>
-              <w:t>日常办公文档生成</w:t>
+              <w:t>制度问答与依据引用</w:t>
             </w:r>
           </w:p>
         </w:tc>
@@ -7420,7 +7732,7 @@
                 <w:b w:val="0"/>
                 <w:sz w:val="16"/>
               </w:rPr>
-              <w:t>纪要、报告、请示、方案、整改清单</w:t>
+              <w:t>带依据的问答结果、待核验事项</w:t>
             </w:r>
           </w:p>
         </w:tc>
@@ -7451,7 +7763,7 @@
                 <w:b w:val="0"/>
                 <w:sz w:val="16"/>
               </w:rPr>
-              <w:t>是否结构规范、语气合适、少改可用，人工修改耗时是否减少</w:t>
+              <w:t>是否引用准确、边界清楚，是否能在合理时间内完成</w:t>
             </w:r>
           </w:p>
         </w:tc>
@@ -7483,7 +7795,7 @@
                 <w:b w:val="0"/>
                 <w:sz w:val="16"/>
               </w:rPr>
-              <w:t>典型流程表单审核</w:t>
+              <w:t>典型业务表单辅助检查</w:t>
             </w:r>
           </w:p>
         </w:tc>
@@ -7513,7 +7825,7 @@
                 <w:b w:val="0"/>
                 <w:sz w:val="16"/>
               </w:rPr>
-              <w:t>审核意见、缺项清单、风险提示</w:t>
+              <w:t>一单两票或甲方指定表单的检查意见、缺项清单、风险提示</w:t>
             </w:r>
           </w:p>
         </w:tc>
@@ -7670,7 +7982,7 @@
                 <w:b w:val="0"/>
                 <w:sz w:val="16"/>
               </w:rPr>
-              <w:t>计划编制与任务分解</w:t>
+              <w:t>检修计划与任务分解</w:t>
             </w:r>
           </w:p>
         </w:tc>
@@ -7763,7 +8075,7 @@
                 <w:b w:val="0"/>
                 <w:sz w:val="16"/>
               </w:rPr>
-              <w:t>缺陷或问题闭环</w:t>
+              <w:t>缺陷或问题闭环与复盘材料</w:t>
             </w:r>
           </w:p>
         </w:tc>
@@ -9434,7 +9746,7 @@
                 <w:b w:val="0"/>
                 <w:sz w:val="16"/>
               </w:rPr>
-              <w:t>评价资料接入、数据安全、权限边界和审计要求</w:t>
+              <w:t>评价资料接入、运行边界、权限留痕和实施适配</w:t>
             </w:r>
           </w:p>
         </w:tc>
@@ -9842,7 +10154,7 @@
                 <w:b w:val="0"/>
                 <w:sz w:val="16"/>
               </w:rPr>
-              <w:t>具备落地价值，需补齐部分场景、合规或运维条件</w:t>
+              <w:t>具备落地价值，需补齐部分场景、运行保障或运维条件</w:t>
             </w:r>
           </w:p>
         </w:tc>
@@ -10206,7 +10518,7 @@
           <w:rFonts w:ascii="宋体" w:hAnsi="宋体" w:eastAsia="宋体"/>
           <w:sz w:val="21"/>
         </w:rPr>
-        <w:t>4. 数据安全、终端环境和系统接入前置条件。</w:t>
+        <w:t>4. 资料处理、运行保障和系统接入前置条件。</w:t>
       </w:r>
     </w:p>
     <w:p>
@@ -10261,7 +10573,7 @@
           <w:color w:val="2F5597"/>
           <w:sz w:val="30"/>
         </w:rPr>
-        <w:t>十一、中立措辞要求</w:t>
+        <w:t>十一、能力导向措辞要求</w:t>
       </w:r>
     </w:p>
     <w:p>
@@ -10412,7 +10724,7 @@
                 <w:b w:val="0"/>
                 <w:sz w:val="16"/>
               </w:rPr>
-              <w:t>具备多步骤任务协同和过程可追踪能力</w:t>
+              <w:t>具备多步骤任务协同和过程留痕能力</w:t>
             </w:r>
           </w:p>
         </w:tc>
@@ -10476,7 +10788,7 @@
                 <w:b w:val="0"/>
                 <w:sz w:val="16"/>
               </w:rPr>
-              <w:t>具备可扩展工具或业务系统接入能力</w:t>
+              <w:t>具备可扩展工具或业务系统协同能力</w:t>
             </w:r>
           </w:p>
         </w:tc>
@@ -10538,7 +10850,7 @@
                 <w:b w:val="0"/>
                 <w:sz w:val="16"/>
               </w:rPr>
-              <w:t>符合甲方终端环境与数据安全要求的交付方式</w:t>
+              <w:t>符合甲方既有终端和运行管理要求的交付方式</w:t>
             </w:r>
           </w:p>
         </w:tc>
@@ -10571,7 +10883,7 @@
                 <w:b w:val="0"/>
                 <w:sz w:val="16"/>
               </w:rPr>
-              <w:t>必须支持工作票、操作票</w:t>
+              <w:t>将一单两票写成准入条件</w:t>
             </w:r>
           </w:p>
         </w:tc>
@@ -10602,7 +10914,7 @@
                 <w:b w:val="0"/>
                 <w:sz w:val="16"/>
               </w:rPr>
-              <w:t>能适配甲方典型流程表单和作业类业务场景</w:t>
+              <w:t>能适配甲方指定的典型业务表单和流程材料</w:t>
             </w:r>
           </w:p>
         </w:tc>
@@ -10664,7 +10976,7 @@
                 <w:b w:val="0"/>
                 <w:sz w:val="16"/>
               </w:rPr>
-              <w:t>具备对应业务技能或可复用能力模板</w:t>
+              <w:t>具备对应业务能力或可复用任务模板</w:t>
             </w:r>
           </w:p>
         </w:tc>
@@ -12003,7 +12315,7 @@
           <w:rFonts w:ascii="宋体" w:hAnsi="宋体" w:eastAsia="宋体"/>
           <w:sz w:val="21"/>
         </w:rPr>
-        <w:t>本文件为评价体系建议稿。涉及具体制度、流程、表单、系统接口、数据分类分级和安全要求时，应以甲方现行制度、脱敏样例材料和信息安全要求为准。效率、稳定性和成本相关指标应结合任务难度、材料完整性、终端环境和试用人员熟悉程度综合判断，不作为脱离业务产物质量的单独排名依据。</w:t>
+        <w:t>本文件为评价体系建议稿。涉及具体制度、流程、表单、系统接口、数据分类分级和运行管理要求时，应以甲方现行制度、脱敏样例材料和管理要求为准。效率、稳定性和成本相关指标应结合任务难度、材料完整性、终端环境和试用人员熟悉程度综合判断，不作为脱离业务产物质量的单独排名依据。</w:t>
       </w:r>
     </w:p>
     <w:sectPr>

</xml_diff>